<commit_message>
generador con SelectPdf, test
</commit_message>
<xml_diff>
--- a/Danec.PdfGenerator/src/Danec.PdfGenerator.Api/Templates/docx/factura.docx
+++ b/Danec.PdfGenerator/src/Danec.PdfGenerator.Api/Templates/docx/factura.docx
@@ -2,6 +2,21 @@
 <file path=word/document.xml><?xml version="1.0" encoding="utf-8"?>
 <w:document xmlns:wpc="http://schemas.microsoft.com/office/word/2010/wordprocessingCanvas" xmlns:cx="http://schemas.microsoft.com/office/drawing/2014/chartex" xmlns:cx1="http://schemas.microsoft.com/office/drawing/2015/9/8/chartex" xmlns:cx2="http://schemas.microsoft.com/office/drawing/2015/10/21/chartex" xmlns:cx3="http://schemas.microsoft.com/office/drawing/2016/5/9/chartex" xmlns:cx4="http://schemas.microsoft.com/office/drawing/2016/5/10/chartex" xmlns:cx5="http://schemas.microsoft.com/office/drawing/2016/5/11/chartex" xmlns:cx6="http://schemas.microsoft.com/office/drawing/2016/5/12/chartex" xmlns:cx7="http://schemas.microsoft.com/office/drawing/2016/5/13/chartex" xmlns:cx8="http://schemas.microsoft.com/office/drawing/2016/5/14/chartex" xmlns:mc="http://schemas.openxmlformats.org/markup-compatibility/2006" xmlns:aink="http://schemas.microsoft.com/office/drawing/2016/ink" xmlns:am3d="http://schemas.microsoft.com/office/drawing/2017/model3d" xmlns:o="urn:schemas-microsoft-com:office:office" xmlns:oel="http://schemas.microsoft.com/office/2019/extlst" xmlns:r="http://schemas.openxmlformats.org/officeDocument/2006/relationships" xmlns:m="http://schemas.openxmlformats.org/officeDocument/2006/math" xmlns:v="urn:schemas-microsoft-com:vml" xmlns:wp14="http://schemas.microsoft.com/office/word/2010/wordprocessingDrawing" xmlns:wp="http://schemas.openxmlformats.org/drawingml/2006/wordprocessingDrawing" xmlns:w10="urn:schemas-microsoft-com:office:word" xmlns:w="http://schemas.openxmlformats.org/wordprocessingml/2006/main" xmlns:w14="http://schemas.microsoft.com/office/word/2010/wordml" xmlns:w15="http://schemas.microsoft.com/office/word/2012/wordml" xmlns:w16cex="http://schemas.microsoft.com/office/word/2018/wordml/cex" xmlns:w16cid="http://schemas.microsoft.com/office/word/2016/wordml/cid" xmlns:w16="http://schemas.microsoft.com/office/word/2018/wordml" xmlns:w16du="http://schemas.microsoft.com/office/word/2023/wordml/word16du" xmlns:w16sdtdh="http://schemas.microsoft.com/office/word/2020/wordml/sdtdatahash" xmlns:w16sdtfl="http://schemas.microsoft.com/office/word/2024/wordml/sdtformatlock" xmlns:w16se="http://schemas.microsoft.com/office/word/2015/wordml/symex" xmlns:wpg="http://schemas.microsoft.com/office/word/2010/wordprocessingGroup" xmlns:wpi="http://schemas.microsoft.com/office/word/2010/wordprocessingInk" xmlns:wne="http://schemas.microsoft.com/office/word/2006/wordml" xmlns:wps="http://schemas.microsoft.com/office/word/2010/wordprocessingShape" mc:Ignorable="w14 w15 w16se w16cid w16 w16cex w16sdtdh w16sdtfl w16du wp14">
   <w:body>
+    <w:p/>
+    <w:p>
+      <w:pPr>
+        <w:rPr>
+          <w:u w:val="single"/>
+        </w:rPr>
+      </w:pPr>
+    </w:p>
+    <w:p>
+      <w:pPr>
+        <w:rPr>
+          <w:u w:val="single"/>
+        </w:rPr>
+      </w:pPr>
+    </w:p>
     <w:tbl>
       <w:tblPr>
         <w:tblW w:w="0" w:type="auto"/>
@@ -28,6 +43,9 @@
           <w:p>
             <w:pPr>
               <w:rPr>
+                <w:b/>
+                <w:color w:val="1F4E79"/>
+                <w:sz w:val="36"/>
                 <w:lang w:val="es-EC"/>
               </w:rPr>
             </w:pPr>
@@ -64,6 +82,7 @@
           <w:p>
             <w:pPr>
               <w:rPr>
+                <w:u w:val="single"/>
                 <w:lang w:val="es-EC"/>
               </w:rPr>
             </w:pPr>
@@ -71,7 +90,13 @@
               <w:rPr>
                 <w:lang w:val="es-EC"/>
               </w:rPr>
-              <w:t>RUC: {{</w:t>
+              <w:t xml:space="preserve">RUC: </w:t>
+            </w:r>
+            <w:r>
+              <w:rPr>
+                <w:lang w:val="es-EC"/>
+              </w:rPr>
+              <w:t>{{</w:t>
             </w:r>
             <w:proofErr w:type="spellStart"/>
             <w:r>
@@ -320,6 +345,7 @@
             <w:shd w:val="clear" w:color="auto" w:fill="1F4E79"/>
           </w:tcPr>
           <w:p>
+            <w:proofErr w:type="spellStart"/>
             <w:r>
               <w:rPr>
                 <w:b/>
@@ -328,6 +354,7 @@
               </w:rPr>
               <w:t>Descripción</w:t>
             </w:r>
+            <w:proofErr w:type="spellEnd"/>
           </w:p>
         </w:tc>
         <w:tc>
@@ -364,8 +391,18 @@
                 <w:color w:val="FFFFFF"/>
                 <w:sz w:val="18"/>
               </w:rPr>
-              <w:t>P. unitario</w:t>
+              <w:t xml:space="preserve">P. </w:t>
             </w:r>
+            <w:proofErr w:type="spellStart"/>
+            <w:r>
+              <w:rPr>
+                <w:b/>
+                <w:color w:val="FFFFFF"/>
+                <w:sz w:val="18"/>
+              </w:rPr>
+              <w:t>unitario</w:t>
+            </w:r>
+            <w:proofErr w:type="spellEnd"/>
           </w:p>
         </w:tc>
         <w:tc>
@@ -404,7 +441,23 @@
               <w:rPr>
                 <w:sz w:val="18"/>
               </w:rPr>
-              <w:t>{{items.codigo}}</w:t>
+              <w:t>{{</w:t>
+            </w:r>
+            <w:proofErr w:type="spellStart"/>
+            <w:proofErr w:type="gramStart"/>
+            <w:r>
+              <w:rPr>
+                <w:sz w:val="18"/>
+              </w:rPr>
+              <w:t>items.codigo</w:t>
+            </w:r>
+            <w:proofErr w:type="spellEnd"/>
+            <w:proofErr w:type="gramEnd"/>
+            <w:r>
+              <w:rPr>
+                <w:sz w:val="18"/>
+              </w:rPr>
+              <w:t>}}</w:t>
             </w:r>
           </w:p>
         </w:tc>
@@ -420,7 +473,23 @@
               <w:rPr>
                 <w:sz w:val="18"/>
               </w:rPr>
-              <w:t>{{items.descripcion}}</w:t>
+              <w:t>{{</w:t>
+            </w:r>
+            <w:proofErr w:type="spellStart"/>
+            <w:proofErr w:type="gramStart"/>
+            <w:r>
+              <w:rPr>
+                <w:sz w:val="18"/>
+              </w:rPr>
+              <w:t>items.descripcion</w:t>
+            </w:r>
+            <w:proofErr w:type="spellEnd"/>
+            <w:proofErr w:type="gramEnd"/>
+            <w:r>
+              <w:rPr>
+                <w:sz w:val="18"/>
+              </w:rPr>
+              <w:t>}}</w:t>
             </w:r>
           </w:p>
         </w:tc>
@@ -439,7 +508,23 @@
               <w:rPr>
                 <w:sz w:val="18"/>
               </w:rPr>
-              <w:t>{{items.cantidad}}</w:t>
+              <w:t>{{</w:t>
+            </w:r>
+            <w:proofErr w:type="spellStart"/>
+            <w:proofErr w:type="gramStart"/>
+            <w:r>
+              <w:rPr>
+                <w:sz w:val="18"/>
+              </w:rPr>
+              <w:t>items.cantidad</w:t>
+            </w:r>
+            <w:proofErr w:type="spellEnd"/>
+            <w:proofErr w:type="gramEnd"/>
+            <w:r>
+              <w:rPr>
+                <w:sz w:val="18"/>
+              </w:rPr>
+              <w:t>}}</w:t>
             </w:r>
           </w:p>
         </w:tc>
@@ -458,7 +543,23 @@
               <w:rPr>
                 <w:sz w:val="18"/>
               </w:rPr>
-              <w:t>{{items.precio}}</w:t>
+              <w:t>{{</w:t>
+            </w:r>
+            <w:proofErr w:type="spellStart"/>
+            <w:proofErr w:type="gramStart"/>
+            <w:r>
+              <w:rPr>
+                <w:sz w:val="18"/>
+              </w:rPr>
+              <w:t>items.precio</w:t>
+            </w:r>
+            <w:proofErr w:type="spellEnd"/>
+            <w:proofErr w:type="gramEnd"/>
+            <w:r>
+              <w:rPr>
+                <w:sz w:val="18"/>
+              </w:rPr>
+              <w:t>}}</w:t>
             </w:r>
           </w:p>
         </w:tc>
@@ -477,7 +578,23 @@
               <w:rPr>
                 <w:sz w:val="18"/>
               </w:rPr>
-              <w:t>{{items.total}}</w:t>
+              <w:t>{{</w:t>
+            </w:r>
+            <w:proofErr w:type="spellStart"/>
+            <w:proofErr w:type="gramStart"/>
+            <w:r>
+              <w:rPr>
+                <w:sz w:val="18"/>
+              </w:rPr>
+              <w:t>items.total</w:t>
+            </w:r>
+            <w:proofErr w:type="spellEnd"/>
+            <w:proofErr w:type="gramEnd"/>
+            <w:r>
+              <w:rPr>
+                <w:sz w:val="18"/>
+              </w:rPr>
+              <w:t>}}</w:t>
             </w:r>
           </w:p>
         </w:tc>
@@ -547,7 +664,15 @@
           </w:tcPr>
           <w:p>
             <w:r>
-              <w:t>IVA {{iva_porcentaje}} %</w:t>
+              <w:t>IVA {{</w:t>
+            </w:r>
+            <w:proofErr w:type="spellStart"/>
+            <w:r>
+              <w:t>iva_porcentaje</w:t>
+            </w:r>
+            <w:proofErr w:type="spellEnd"/>
+            <w:r>
+              <w:t>}} %</w:t>
             </w:r>
           </w:p>
         </w:tc>
@@ -560,7 +685,15 @@
               <w:jc w:val="right"/>
             </w:pPr>
             <w:r>
-              <w:t>{{iva}}</w:t>
+              <w:t>{{</w:t>
+            </w:r>
+            <w:proofErr w:type="spellStart"/>
+            <w:r>
+              <w:t>iva</w:t>
+            </w:r>
+            <w:proofErr w:type="spellEnd"/>
+            <w:r>
+              <w:t>}}</w:t>
             </w:r>
           </w:p>
         </w:tc>
@@ -615,32 +748,127 @@
     </w:tbl>
     <w:p/>
     <w:p>
+      <w:pPr>
+        <w:rPr>
+          <w:color w:val="666666"/>
+          <w:sz w:val="16"/>
+        </w:rPr>
+      </w:pPr>
+      <w:proofErr w:type="spellStart"/>
       <w:proofErr w:type="gramStart"/>
       <w:r>
         <w:rPr>
           <w:color w:val="666666"/>
           <w:sz w:val="16"/>
         </w:rPr>
-        <w:t>Observaciones: {{</w:t>
+        <w:t>Observaciones</w:t>
       </w:r>
+      <w:proofErr w:type="spellEnd"/>
+      <w:r>
+        <w:rPr>
+          <w:color w:val="666666"/>
+          <w:sz w:val="16"/>
+        </w:rPr>
+        <w:t>: {{</w:t>
+      </w:r>
+      <w:proofErr w:type="spellStart"/>
       <w:proofErr w:type="gramEnd"/>
       <w:r>
         <w:rPr>
           <w:color w:val="666666"/>
           <w:sz w:val="16"/>
         </w:rPr>
-        <w:t>observaciones}}</w:t>
+        <w:t>observaciones</w:t>
+      </w:r>
+      <w:proofErr w:type="spellEnd"/>
+      <w:r>
+        <w:rPr>
+          <w:color w:val="666666"/>
+          <w:sz w:val="16"/>
+        </w:rPr>
+        <w:t>}}</w:t>
+      </w:r>
+    </w:p>
+    <w:p>
+      <w:pPr>
+        <w:spacing w:after="200"/>
+        <w:rPr>
+          <w:color w:val="666666"/>
+          <w:sz w:val="16"/>
+        </w:rPr>
+      </w:pPr>
+      <w:r>
+        <w:rPr>
+          <w:color w:val="666666"/>
+          <w:sz w:val="16"/>
+        </w:rPr>
+        <w:br w:type="page"/>
+      </w:r>
+    </w:p>
+    <w:p>
+      <w:r>
+        <w:lastRenderedPageBreak/>
+        <w:t>JAVIER PINTO</w:t>
+      </w:r>
+    </w:p>
+    <w:p/>
+    <w:p>
+      <w:pPr>
+        <w:rPr>
+          <w:u w:val="single"/>
+        </w:rPr>
+      </w:pPr>
+      <w:r>
+        <w:rPr>
+          <w:noProof/>
+          <w:u w:val="single"/>
+        </w:rPr>
+        <w:drawing>
+          <wp:inline distT="0" distB="0" distL="0" distR="0" wp14:anchorId="77E83C55" wp14:editId="63C85D28">
+            <wp:extent cx="6264910" cy="3944620"/>
+            <wp:effectExtent l="0" t="0" r="2540" b="0"/>
+            <wp:docPr id="1948133236" name="Imagen 4"/>
+            <wp:cNvGraphicFramePr>
+              <a:graphicFrameLocks xmlns:a="http://schemas.openxmlformats.org/drawingml/2006/main" noChangeAspect="1"/>
+            </wp:cNvGraphicFramePr>
+            <a:graphic xmlns:a="http://schemas.openxmlformats.org/drawingml/2006/main">
+              <a:graphicData uri="http://schemas.openxmlformats.org/drawingml/2006/picture">
+                <pic:pic xmlns:pic="http://schemas.openxmlformats.org/drawingml/2006/picture">
+                  <pic:nvPicPr>
+                    <pic:cNvPr id="1948133236" name="Imagen 1948133236"/>
+                    <pic:cNvPicPr/>
+                  </pic:nvPicPr>
+                  <pic:blipFill>
+                    <a:blip r:embed="rId8"/>
+                    <a:stretch>
+                      <a:fillRect/>
+                    </a:stretch>
+                  </pic:blipFill>
+                  <pic:spPr>
+                    <a:xfrm>
+                      <a:off x="0" y="0"/>
+                      <a:ext cx="6264910" cy="3944620"/>
+                    </a:xfrm>
+                    <a:prstGeom prst="rect">
+                      <a:avLst/>
+                    </a:prstGeom>
+                  </pic:spPr>
+                </pic:pic>
+              </a:graphicData>
+            </a:graphic>
+          </wp:inline>
+        </w:drawing>
       </w:r>
     </w:p>
     <w:sectPr>
-      <w:headerReference w:type="even" r:id="rId8"/>
-      <w:headerReference w:type="default" r:id="rId9"/>
-      <w:footerReference w:type="even" r:id="rId10"/>
-      <w:footerReference w:type="default" r:id="rId11"/>
-      <w:headerReference w:type="first" r:id="rId12"/>
-      <w:footerReference w:type="first" r:id="rId13"/>
+      <w:headerReference w:type="even" r:id="rId9"/>
+      <w:headerReference w:type="default" r:id="rId10"/>
+      <w:footerReference w:type="even" r:id="rId11"/>
+      <w:footerReference w:type="default" r:id="rId12"/>
+      <w:headerReference w:type="first" r:id="rId13"/>
+      <w:footerReference w:type="first" r:id="rId14"/>
       <w:pgSz w:w="11906" w:h="16838"/>
-      <w:pgMar w:top="907" w:right="1020" w:bottom="907" w:left="1020" w:header="720" w:footer="720" w:gutter="0"/>
+      <w:pgMar w:top="1913" w:right="1020" w:bottom="907" w:left="1020" w:header="720" w:footer="720" w:gutter="0"/>
       <w:cols w:space="720"/>
       <w:docGrid w:linePitch="360"/>
     </w:sectPr>
@@ -677,8 +905,122 @@
 <w:ftr xmlns:wpc="http://schemas.microsoft.com/office/word/2010/wordprocessingCanvas" xmlns:cx="http://schemas.microsoft.com/office/drawing/2014/chartex" xmlns:cx1="http://schemas.microsoft.com/office/drawing/2015/9/8/chartex" xmlns:cx2="http://schemas.microsoft.com/office/drawing/2015/10/21/chartex" xmlns:cx3="http://schemas.microsoft.com/office/drawing/2016/5/9/chartex" xmlns:cx4="http://schemas.microsoft.com/office/drawing/2016/5/10/chartex" xmlns:cx5="http://schemas.microsoft.com/office/drawing/2016/5/11/chartex" xmlns:cx6="http://schemas.microsoft.com/office/drawing/2016/5/12/chartex" xmlns:cx7="http://schemas.microsoft.com/office/drawing/2016/5/13/chartex" xmlns:cx8="http://schemas.microsoft.com/office/drawing/2016/5/14/chartex" xmlns:mc="http://schemas.openxmlformats.org/markup-compatibility/2006" xmlns:aink="http://schemas.microsoft.com/office/drawing/2016/ink" xmlns:am3d="http://schemas.microsoft.com/office/drawing/2017/model3d" xmlns:o="urn:schemas-microsoft-com:office:office" xmlns:oel="http://schemas.microsoft.com/office/2019/extlst" xmlns:r="http://schemas.openxmlformats.org/officeDocument/2006/relationships" xmlns:m="http://schemas.openxmlformats.org/officeDocument/2006/math" xmlns:v="urn:schemas-microsoft-com:vml" xmlns:wp14="http://schemas.microsoft.com/office/word/2010/wordprocessingDrawing" xmlns:wp="http://schemas.openxmlformats.org/drawingml/2006/wordprocessingDrawing" xmlns:w10="urn:schemas-microsoft-com:office:word" xmlns:w="http://schemas.openxmlformats.org/wordprocessingml/2006/main" xmlns:w14="http://schemas.microsoft.com/office/word/2010/wordml" xmlns:w15="http://schemas.microsoft.com/office/word/2012/wordml" xmlns:w16cex="http://schemas.microsoft.com/office/word/2018/wordml/cex" xmlns:w16cid="http://schemas.microsoft.com/office/word/2016/wordml/cid" xmlns:w16="http://schemas.microsoft.com/office/word/2018/wordml" xmlns:w16du="http://schemas.microsoft.com/office/word/2023/wordml/word16du" xmlns:w16sdtdh="http://schemas.microsoft.com/office/word/2020/wordml/sdtdatahash" xmlns:w16sdtfl="http://schemas.microsoft.com/office/word/2024/wordml/sdtformatlock" xmlns:w16se="http://schemas.microsoft.com/office/word/2015/wordml/symex" xmlns:wpg="http://schemas.microsoft.com/office/word/2010/wordprocessingGroup" xmlns:wpi="http://schemas.microsoft.com/office/word/2010/wordprocessingInk" xmlns:wne="http://schemas.microsoft.com/office/word/2006/wordml" xmlns:wps="http://schemas.microsoft.com/office/word/2010/wordprocessingShape" mc:Ignorable="w14 w15 w16se w16cid w16 w16cex w16sdtdh w16sdtfl w16du wp14">
   <w:p>
     <w:pPr>
-      <w:pStyle w:val="Footer"/>
-    </w:pPr>
+      <w:pStyle w:val="Piedepgina"/>
+    </w:pPr>
+    <w:r>
+      <w:rPr>
+        <w:noProof/>
+      </w:rPr>
+      <mc:AlternateContent>
+        <mc:Choice Requires="wps">
+          <w:drawing>
+            <wp:anchor distT="0" distB="0" distL="0" distR="0" simplePos="0" relativeHeight="251660288" behindDoc="0" locked="0" layoutInCell="1" allowOverlap="1" wp14:anchorId="59076E00" wp14:editId="43AD0776">
+              <wp:simplePos x="635" y="635"/>
+              <wp:positionH relativeFrom="page">
+                <wp:align>left</wp:align>
+              </wp:positionH>
+              <wp:positionV relativeFrom="page">
+                <wp:align>bottom</wp:align>
+              </wp:positionV>
+              <wp:extent cx="1077595" cy="368935"/>
+              <wp:effectExtent l="0" t="0" r="8255" b="0"/>
+              <wp:wrapNone/>
+              <wp:docPr id="1765277053" name="Cuadro de texto 3" descr="USO_INTERNO">
+                <a:extLst xmlns:a="http://schemas.openxmlformats.org/drawingml/2006/main">
+                  <a:ext uri="{5AE41FA2-C0FF-4470-9BD4-5FADCA87CBE2}">
+                    <aclsh:classification xmlns:aclsh="http://schemas.microsoft.com/office/drawing/2020/classificationShape" classificationOutcomeType="ftr"/>
+                  </a:ext>
+                </a:extLst>
+              </wp:docPr>
+              <wp:cNvGraphicFramePr/>
+              <a:graphic xmlns:a="http://schemas.openxmlformats.org/drawingml/2006/main">
+                <a:graphicData uri="http://schemas.microsoft.com/office/word/2010/wordprocessingShape">
+                  <wps:wsp>
+                    <wps:cNvSpPr txBox="1"/>
+                    <wps:spPr>
+                      <a:xfrm>
+                        <a:off x="0" y="0"/>
+                        <a:ext cx="1077595" cy="368935"/>
+                      </a:xfrm>
+                      <a:prstGeom prst="rect">
+                        <a:avLst/>
+                      </a:prstGeom>
+                      <a:noFill/>
+                      <a:ln>
+                        <a:noFill/>
+                      </a:ln>
+                    </wps:spPr>
+                    <wps:txbx>
+                      <w:txbxContent>
+                        <w:p>
+                          <w:pPr>
+                            <w:rPr>
+                              <w:rFonts w:ascii="Aptos" w:eastAsia="Aptos" w:hAnsi="Aptos" w:cs="Aptos"/>
+                              <w:noProof/>
+                              <w:color w:val="000000"/>
+                              <w:szCs w:val="20"/>
+                            </w:rPr>
+                          </w:pPr>
+                          <w:r>
+                            <w:rPr>
+                              <w:rFonts w:ascii="Aptos" w:eastAsia="Aptos" w:hAnsi="Aptos" w:cs="Aptos"/>
+                              <w:noProof/>
+                              <w:color w:val="000000"/>
+                              <w:szCs w:val="20"/>
+                            </w:rPr>
+                            <w:t>USO_INTERNO</w:t>
+                          </w:r>
+                        </w:p>
+                      </w:txbxContent>
+                    </wps:txbx>
+                    <wps:bodyPr rot="0" spcFirstLastPara="0" vertOverflow="overflow" horzOverflow="overflow" vert="horz" wrap="none" lIns="254000" tIns="0" rIns="0" bIns="190500" numCol="1" spcCol="0" rtlCol="0" fromWordArt="0" anchor="b" anchorCtr="0" forceAA="0" compatLnSpc="1">
+                      <a:prstTxWarp prst="textNoShape">
+                        <a:avLst/>
+                      </a:prstTxWarp>
+                      <a:spAutoFit/>
+                    </wps:bodyPr>
+                  </wps:wsp>
+                </a:graphicData>
+              </a:graphic>
+            </wp:anchor>
+          </w:drawing>
+        </mc:Choice>
+        <mc:Fallback>
+          <w:pict>
+            <v:shapetype w14:anchorId="59076E00" id="_x0000_t202" coordsize="21600,21600" o:spt="202" path="m,l,21600r21600,l21600,xe">
+              <v:stroke joinstyle="miter"/>
+              <v:path gradientshapeok="t" o:connecttype="rect"/>
+            </v:shapetype>
+            <v:shape id="Cuadro de texto 3" o:spid="_x0000_s1026" type="#_x0000_t202" alt="USO_INTERNO" style="position:absolute;margin-left:0;margin-top:0;width:84.85pt;height:29.05pt;z-index:251660288;visibility:visible;mso-wrap-style:none;mso-wrap-distance-left:0;mso-wrap-distance-top:0;mso-wrap-distance-right:0;mso-wrap-distance-bottom:0;mso-position-horizontal:left;mso-position-horizontal-relative:page;mso-position-vertical:bottom;mso-position-vertical-relative:page;v-text-anchor:bottom" o:gfxdata="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" filled="f" stroked="f">
+              <v:textbox style="mso-fit-shape-to-text:t" inset="20pt,0,0,15pt">
+                <w:txbxContent>
+                  <w:p>
+                    <w:pPr>
+                      <w:rPr>
+                        <w:rFonts w:ascii="Aptos" w:eastAsia="Aptos" w:hAnsi="Aptos" w:cs="Aptos"/>
+                        <w:noProof/>
+                        <w:color w:val="000000"/>
+                        <w:szCs w:val="20"/>
+                      </w:rPr>
+                    </w:pPr>
+                    <w:r>
+                      <w:rPr>
+                        <w:rFonts w:ascii="Aptos" w:eastAsia="Aptos" w:hAnsi="Aptos" w:cs="Aptos"/>
+                        <w:noProof/>
+                        <w:color w:val="000000"/>
+                        <w:szCs w:val="20"/>
+                      </w:rPr>
+                      <w:t>USO_INTERNO</w:t>
+                    </w:r>
+                  </w:p>
+                </w:txbxContent>
+              </v:textbox>
+              <w10:wrap anchorx="page" anchory="page"/>
+            </v:shape>
+          </w:pict>
+        </mc:Fallback>
+      </mc:AlternateContent>
+    </w:r>
   </w:p>
 </w:ftr>
 </file>
@@ -687,8 +1029,122 @@
 <w:ftr xmlns:wpc="http://schemas.microsoft.com/office/word/2010/wordprocessingCanvas" xmlns:cx="http://schemas.microsoft.com/office/drawing/2014/chartex" xmlns:cx1="http://schemas.microsoft.com/office/drawing/2015/9/8/chartex" xmlns:cx2="http://schemas.microsoft.com/office/drawing/2015/10/21/chartex" xmlns:cx3="http://schemas.microsoft.com/office/drawing/2016/5/9/chartex" xmlns:cx4="http://schemas.microsoft.com/office/drawing/2016/5/10/chartex" xmlns:cx5="http://schemas.microsoft.com/office/drawing/2016/5/11/chartex" xmlns:cx6="http://schemas.microsoft.com/office/drawing/2016/5/12/chartex" xmlns:cx7="http://schemas.microsoft.com/office/drawing/2016/5/13/chartex" xmlns:cx8="http://schemas.microsoft.com/office/drawing/2016/5/14/chartex" xmlns:mc="http://schemas.openxmlformats.org/markup-compatibility/2006" xmlns:aink="http://schemas.microsoft.com/office/drawing/2016/ink" xmlns:am3d="http://schemas.microsoft.com/office/drawing/2017/model3d" xmlns:o="urn:schemas-microsoft-com:office:office" xmlns:oel="http://schemas.microsoft.com/office/2019/extlst" xmlns:r="http://schemas.openxmlformats.org/officeDocument/2006/relationships" xmlns:m="http://schemas.openxmlformats.org/officeDocument/2006/math" xmlns:v="urn:schemas-microsoft-com:vml" xmlns:wp14="http://schemas.microsoft.com/office/word/2010/wordprocessingDrawing" xmlns:wp="http://schemas.openxmlformats.org/drawingml/2006/wordprocessingDrawing" xmlns:w10="urn:schemas-microsoft-com:office:word" xmlns:w="http://schemas.openxmlformats.org/wordprocessingml/2006/main" xmlns:w14="http://schemas.microsoft.com/office/word/2010/wordml" xmlns:w15="http://schemas.microsoft.com/office/word/2012/wordml" xmlns:w16cex="http://schemas.microsoft.com/office/word/2018/wordml/cex" xmlns:w16cid="http://schemas.microsoft.com/office/word/2016/wordml/cid" xmlns:w16="http://schemas.microsoft.com/office/word/2018/wordml" xmlns:w16du="http://schemas.microsoft.com/office/word/2023/wordml/word16du" xmlns:w16sdtdh="http://schemas.microsoft.com/office/word/2020/wordml/sdtdatahash" xmlns:w16sdtfl="http://schemas.microsoft.com/office/word/2024/wordml/sdtformatlock" xmlns:w16se="http://schemas.microsoft.com/office/word/2015/wordml/symex" xmlns:wpg="http://schemas.microsoft.com/office/word/2010/wordprocessingGroup" xmlns:wpi="http://schemas.microsoft.com/office/word/2010/wordprocessingInk" xmlns:wne="http://schemas.microsoft.com/office/word/2006/wordml" xmlns:wps="http://schemas.microsoft.com/office/word/2010/wordprocessingShape" mc:Ignorable="w14 w15 w16se w16cid w16 w16cex w16sdtdh w16sdtfl w16du wp14">
   <w:p>
     <w:pPr>
-      <w:pStyle w:val="Footer"/>
-    </w:pPr>
+      <w:pStyle w:val="Piedepgina"/>
+    </w:pPr>
+    <w:r>
+      <w:rPr>
+        <w:noProof/>
+      </w:rPr>
+      <mc:AlternateContent>
+        <mc:Choice Requires="wps">
+          <w:drawing>
+            <wp:anchor distT="0" distB="0" distL="0" distR="0" simplePos="0" relativeHeight="251661312" behindDoc="0" locked="0" layoutInCell="1" allowOverlap="1" wp14:anchorId="08B09340" wp14:editId="0703B4AA">
+              <wp:simplePos x="648182" y="10087337"/>
+              <wp:positionH relativeFrom="page">
+                <wp:align>left</wp:align>
+              </wp:positionH>
+              <wp:positionV relativeFrom="page">
+                <wp:align>bottom</wp:align>
+              </wp:positionV>
+              <wp:extent cx="1077595" cy="368935"/>
+              <wp:effectExtent l="0" t="0" r="8255" b="0"/>
+              <wp:wrapNone/>
+              <wp:docPr id="605520104" name="Cuadro de texto 4" descr="USO_INTERNO">
+                <a:extLst xmlns:a="http://schemas.openxmlformats.org/drawingml/2006/main">
+                  <a:ext uri="{5AE41FA2-C0FF-4470-9BD4-5FADCA87CBE2}">
+                    <aclsh:classification xmlns:aclsh="http://schemas.microsoft.com/office/drawing/2020/classificationShape" classificationOutcomeType="ftr"/>
+                  </a:ext>
+                </a:extLst>
+              </wp:docPr>
+              <wp:cNvGraphicFramePr/>
+              <a:graphic xmlns:a="http://schemas.openxmlformats.org/drawingml/2006/main">
+                <a:graphicData uri="http://schemas.microsoft.com/office/word/2010/wordprocessingShape">
+                  <wps:wsp>
+                    <wps:cNvSpPr txBox="1"/>
+                    <wps:spPr>
+                      <a:xfrm>
+                        <a:off x="0" y="0"/>
+                        <a:ext cx="1077595" cy="368935"/>
+                      </a:xfrm>
+                      <a:prstGeom prst="rect">
+                        <a:avLst/>
+                      </a:prstGeom>
+                      <a:noFill/>
+                      <a:ln>
+                        <a:noFill/>
+                      </a:ln>
+                    </wps:spPr>
+                    <wps:txbx>
+                      <w:txbxContent>
+                        <w:p>
+                          <w:pPr>
+                            <w:rPr>
+                              <w:rFonts w:ascii="Aptos" w:eastAsia="Aptos" w:hAnsi="Aptos" w:cs="Aptos"/>
+                              <w:noProof/>
+                              <w:color w:val="000000"/>
+                              <w:szCs w:val="20"/>
+                            </w:rPr>
+                          </w:pPr>
+                          <w:r>
+                            <w:rPr>
+                              <w:rFonts w:ascii="Aptos" w:eastAsia="Aptos" w:hAnsi="Aptos" w:cs="Aptos"/>
+                              <w:noProof/>
+                              <w:color w:val="000000"/>
+                              <w:szCs w:val="20"/>
+                            </w:rPr>
+                            <w:t>USO_INTERNO</w:t>
+                          </w:r>
+                        </w:p>
+                      </w:txbxContent>
+                    </wps:txbx>
+                    <wps:bodyPr rot="0" spcFirstLastPara="0" vertOverflow="overflow" horzOverflow="overflow" vert="horz" wrap="none" lIns="254000" tIns="0" rIns="0" bIns="190500" numCol="1" spcCol="0" rtlCol="0" fromWordArt="0" anchor="b" anchorCtr="0" forceAA="0" compatLnSpc="1">
+                      <a:prstTxWarp prst="textNoShape">
+                        <a:avLst/>
+                      </a:prstTxWarp>
+                      <a:spAutoFit/>
+                    </wps:bodyPr>
+                  </wps:wsp>
+                </a:graphicData>
+              </a:graphic>
+            </wp:anchor>
+          </w:drawing>
+        </mc:Choice>
+        <mc:Fallback>
+          <w:pict>
+            <v:shapetype w14:anchorId="08B09340" id="_x0000_t202" coordsize="21600,21600" o:spt="202" path="m,l,21600r21600,l21600,xe">
+              <v:stroke joinstyle="miter"/>
+              <v:path gradientshapeok="t" o:connecttype="rect"/>
+            </v:shapetype>
+            <v:shape id="Cuadro de texto 4" o:spid="_x0000_s1027" type="#_x0000_t202" alt="USO_INTERNO" style="position:absolute;margin-left:0;margin-top:0;width:84.85pt;height:29.05pt;z-index:251661312;visibility:visible;mso-wrap-style:none;mso-wrap-distance-left:0;mso-wrap-distance-top:0;mso-wrap-distance-right:0;mso-wrap-distance-bottom:0;mso-position-horizontal:left;mso-position-horizontal-relative:page;mso-position-vertical:bottom;mso-position-vertical-relative:page;v-text-anchor:bottom" o:gfxdata="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" filled="f" stroked="f">
+              <v:textbox style="mso-fit-shape-to-text:t" inset="20pt,0,0,15pt">
+                <w:txbxContent>
+                  <w:p>
+                    <w:pPr>
+                      <w:rPr>
+                        <w:rFonts w:ascii="Aptos" w:eastAsia="Aptos" w:hAnsi="Aptos" w:cs="Aptos"/>
+                        <w:noProof/>
+                        <w:color w:val="000000"/>
+                        <w:szCs w:val="20"/>
+                      </w:rPr>
+                    </w:pPr>
+                    <w:r>
+                      <w:rPr>
+                        <w:rFonts w:ascii="Aptos" w:eastAsia="Aptos" w:hAnsi="Aptos" w:cs="Aptos"/>
+                        <w:noProof/>
+                        <w:color w:val="000000"/>
+                        <w:szCs w:val="20"/>
+                      </w:rPr>
+                      <w:t>USO_INTERNO</w:t>
+                    </w:r>
+                  </w:p>
+                </w:txbxContent>
+              </v:textbox>
+              <w10:wrap anchorx="page" anchory="page"/>
+            </v:shape>
+          </w:pict>
+        </mc:Fallback>
+      </mc:AlternateContent>
+    </w:r>
   </w:p>
 </w:ftr>
 </file>
@@ -697,8 +1153,122 @@
 <w:ftr xmlns:wpc="http://schemas.microsoft.com/office/word/2010/wordprocessingCanvas" xmlns:cx="http://schemas.microsoft.com/office/drawing/2014/chartex" xmlns:cx1="http://schemas.microsoft.com/office/drawing/2015/9/8/chartex" xmlns:cx2="http://schemas.microsoft.com/office/drawing/2015/10/21/chartex" xmlns:cx3="http://schemas.microsoft.com/office/drawing/2016/5/9/chartex" xmlns:cx4="http://schemas.microsoft.com/office/drawing/2016/5/10/chartex" xmlns:cx5="http://schemas.microsoft.com/office/drawing/2016/5/11/chartex" xmlns:cx6="http://schemas.microsoft.com/office/drawing/2016/5/12/chartex" xmlns:cx7="http://schemas.microsoft.com/office/drawing/2016/5/13/chartex" xmlns:cx8="http://schemas.microsoft.com/office/drawing/2016/5/14/chartex" xmlns:mc="http://schemas.openxmlformats.org/markup-compatibility/2006" xmlns:aink="http://schemas.microsoft.com/office/drawing/2016/ink" xmlns:am3d="http://schemas.microsoft.com/office/drawing/2017/model3d" xmlns:o="urn:schemas-microsoft-com:office:office" xmlns:oel="http://schemas.microsoft.com/office/2019/extlst" xmlns:r="http://schemas.openxmlformats.org/officeDocument/2006/relationships" xmlns:m="http://schemas.openxmlformats.org/officeDocument/2006/math" xmlns:v="urn:schemas-microsoft-com:vml" xmlns:wp14="http://schemas.microsoft.com/office/word/2010/wordprocessingDrawing" xmlns:wp="http://schemas.openxmlformats.org/drawingml/2006/wordprocessingDrawing" xmlns:w10="urn:schemas-microsoft-com:office:word" xmlns:w="http://schemas.openxmlformats.org/wordprocessingml/2006/main" xmlns:w14="http://schemas.microsoft.com/office/word/2010/wordml" xmlns:w15="http://schemas.microsoft.com/office/word/2012/wordml" xmlns:w16cex="http://schemas.microsoft.com/office/word/2018/wordml/cex" xmlns:w16cid="http://schemas.microsoft.com/office/word/2016/wordml/cid" xmlns:w16="http://schemas.microsoft.com/office/word/2018/wordml" xmlns:w16du="http://schemas.microsoft.com/office/word/2023/wordml/word16du" xmlns:w16sdtdh="http://schemas.microsoft.com/office/word/2020/wordml/sdtdatahash" xmlns:w16sdtfl="http://schemas.microsoft.com/office/word/2024/wordml/sdtformatlock" xmlns:w16se="http://schemas.microsoft.com/office/word/2015/wordml/symex" xmlns:wpg="http://schemas.microsoft.com/office/word/2010/wordprocessingGroup" xmlns:wpi="http://schemas.microsoft.com/office/word/2010/wordprocessingInk" xmlns:wne="http://schemas.microsoft.com/office/word/2006/wordml" xmlns:wps="http://schemas.microsoft.com/office/word/2010/wordprocessingShape" mc:Ignorable="w14 w15 w16se w16cid w16 w16cex w16sdtdh w16sdtfl w16du wp14">
   <w:p>
     <w:pPr>
-      <w:pStyle w:val="Footer"/>
-    </w:pPr>
+      <w:pStyle w:val="Piedepgina"/>
+    </w:pPr>
+    <w:r>
+      <w:rPr>
+        <w:noProof/>
+      </w:rPr>
+      <mc:AlternateContent>
+        <mc:Choice Requires="wps">
+          <w:drawing>
+            <wp:anchor distT="0" distB="0" distL="0" distR="0" simplePos="0" relativeHeight="251659264" behindDoc="0" locked="0" layoutInCell="1" allowOverlap="1" wp14:anchorId="6C5BCD2C" wp14:editId="3AC122DC">
+              <wp:simplePos x="635" y="635"/>
+              <wp:positionH relativeFrom="page">
+                <wp:align>left</wp:align>
+              </wp:positionH>
+              <wp:positionV relativeFrom="page">
+                <wp:align>bottom</wp:align>
+              </wp:positionV>
+              <wp:extent cx="1077595" cy="368935"/>
+              <wp:effectExtent l="0" t="0" r="8255" b="0"/>
+              <wp:wrapNone/>
+              <wp:docPr id="580340795" name="Cuadro de texto 2" descr="USO_INTERNO">
+                <a:extLst xmlns:a="http://schemas.openxmlformats.org/drawingml/2006/main">
+                  <a:ext uri="{5AE41FA2-C0FF-4470-9BD4-5FADCA87CBE2}">
+                    <aclsh:classification xmlns:aclsh="http://schemas.microsoft.com/office/drawing/2020/classificationShape" classificationOutcomeType="ftr"/>
+                  </a:ext>
+                </a:extLst>
+              </wp:docPr>
+              <wp:cNvGraphicFramePr/>
+              <a:graphic xmlns:a="http://schemas.openxmlformats.org/drawingml/2006/main">
+                <a:graphicData uri="http://schemas.microsoft.com/office/word/2010/wordprocessingShape">
+                  <wps:wsp>
+                    <wps:cNvSpPr txBox="1"/>
+                    <wps:spPr>
+                      <a:xfrm>
+                        <a:off x="0" y="0"/>
+                        <a:ext cx="1077595" cy="368935"/>
+                      </a:xfrm>
+                      <a:prstGeom prst="rect">
+                        <a:avLst/>
+                      </a:prstGeom>
+                      <a:noFill/>
+                      <a:ln>
+                        <a:noFill/>
+                      </a:ln>
+                    </wps:spPr>
+                    <wps:txbx>
+                      <w:txbxContent>
+                        <w:p>
+                          <w:pPr>
+                            <w:rPr>
+                              <w:rFonts w:ascii="Aptos" w:eastAsia="Aptos" w:hAnsi="Aptos" w:cs="Aptos"/>
+                              <w:noProof/>
+                              <w:color w:val="000000"/>
+                              <w:szCs w:val="20"/>
+                            </w:rPr>
+                          </w:pPr>
+                          <w:r>
+                            <w:rPr>
+                              <w:rFonts w:ascii="Aptos" w:eastAsia="Aptos" w:hAnsi="Aptos" w:cs="Aptos"/>
+                              <w:noProof/>
+                              <w:color w:val="000000"/>
+                              <w:szCs w:val="20"/>
+                            </w:rPr>
+                            <w:t>USO_INTERNO</w:t>
+                          </w:r>
+                        </w:p>
+                      </w:txbxContent>
+                    </wps:txbx>
+                    <wps:bodyPr rot="0" spcFirstLastPara="0" vertOverflow="overflow" horzOverflow="overflow" vert="horz" wrap="none" lIns="254000" tIns="0" rIns="0" bIns="190500" numCol="1" spcCol="0" rtlCol="0" fromWordArt="0" anchor="b" anchorCtr="0" forceAA="0" compatLnSpc="1">
+                      <a:prstTxWarp prst="textNoShape">
+                        <a:avLst/>
+                      </a:prstTxWarp>
+                      <a:spAutoFit/>
+                    </wps:bodyPr>
+                  </wps:wsp>
+                </a:graphicData>
+              </a:graphic>
+            </wp:anchor>
+          </w:drawing>
+        </mc:Choice>
+        <mc:Fallback>
+          <w:pict>
+            <v:shapetype w14:anchorId="6C5BCD2C" id="_x0000_t202" coordsize="21600,21600" o:spt="202" path="m,l,21600r21600,l21600,xe">
+              <v:stroke joinstyle="miter"/>
+              <v:path gradientshapeok="t" o:connecttype="rect"/>
+            </v:shapetype>
+            <v:shape id="Cuadro de texto 2" o:spid="_x0000_s1028" type="#_x0000_t202" alt="USO_INTERNO" style="position:absolute;margin-left:0;margin-top:0;width:84.85pt;height:29.05pt;z-index:251659264;visibility:visible;mso-wrap-style:none;mso-wrap-distance-left:0;mso-wrap-distance-top:0;mso-wrap-distance-right:0;mso-wrap-distance-bottom:0;mso-position-horizontal:left;mso-position-horizontal-relative:page;mso-position-vertical:bottom;mso-position-vertical-relative:page;v-text-anchor:bottom" o:gfxdata="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" filled="f" stroked="f">
+              <v:textbox style="mso-fit-shape-to-text:t" inset="20pt,0,0,15pt">
+                <w:txbxContent>
+                  <w:p>
+                    <w:pPr>
+                      <w:rPr>
+                        <w:rFonts w:ascii="Aptos" w:eastAsia="Aptos" w:hAnsi="Aptos" w:cs="Aptos"/>
+                        <w:noProof/>
+                        <w:color w:val="000000"/>
+                        <w:szCs w:val="20"/>
+                      </w:rPr>
+                    </w:pPr>
+                    <w:r>
+                      <w:rPr>
+                        <w:rFonts w:ascii="Aptos" w:eastAsia="Aptos" w:hAnsi="Aptos" w:cs="Aptos"/>
+                        <w:noProof/>
+                        <w:color w:val="000000"/>
+                        <w:szCs w:val="20"/>
+                      </w:rPr>
+                      <w:t>USO_INTERNO</w:t>
+                    </w:r>
+                  </w:p>
+                </w:txbxContent>
+              </v:textbox>
+              <w10:wrap anchorx="page" anchory="page"/>
+            </v:shape>
+          </w:pict>
+        </mc:Fallback>
+      </mc:AlternateContent>
+    </w:r>
   </w:p>
 </w:ftr>
 </file>
@@ -732,7 +1302,7 @@
 <w:hdr xmlns:wpc="http://schemas.microsoft.com/office/word/2010/wordprocessingCanvas" xmlns:cx="http://schemas.microsoft.com/office/drawing/2014/chartex" xmlns:cx1="http://schemas.microsoft.com/office/drawing/2015/9/8/chartex" xmlns:cx2="http://schemas.microsoft.com/office/drawing/2015/10/21/chartex" xmlns:cx3="http://schemas.microsoft.com/office/drawing/2016/5/9/chartex" xmlns:cx4="http://schemas.microsoft.com/office/drawing/2016/5/10/chartex" xmlns:cx5="http://schemas.microsoft.com/office/drawing/2016/5/11/chartex" xmlns:cx6="http://schemas.microsoft.com/office/drawing/2016/5/12/chartex" xmlns:cx7="http://schemas.microsoft.com/office/drawing/2016/5/13/chartex" xmlns:cx8="http://schemas.microsoft.com/office/drawing/2016/5/14/chartex" xmlns:mc="http://schemas.openxmlformats.org/markup-compatibility/2006" xmlns:aink="http://schemas.microsoft.com/office/drawing/2016/ink" xmlns:am3d="http://schemas.microsoft.com/office/drawing/2017/model3d" xmlns:o="urn:schemas-microsoft-com:office:office" xmlns:oel="http://schemas.microsoft.com/office/2019/extlst" xmlns:r="http://schemas.openxmlformats.org/officeDocument/2006/relationships" xmlns:m="http://schemas.openxmlformats.org/officeDocument/2006/math" xmlns:v="urn:schemas-microsoft-com:vml" xmlns:wp14="http://schemas.microsoft.com/office/word/2010/wordprocessingDrawing" xmlns:wp="http://schemas.openxmlformats.org/drawingml/2006/wordprocessingDrawing" xmlns:w10="urn:schemas-microsoft-com:office:word" xmlns:w="http://schemas.openxmlformats.org/wordprocessingml/2006/main" xmlns:w14="http://schemas.microsoft.com/office/word/2010/wordml" xmlns:w15="http://schemas.microsoft.com/office/word/2012/wordml" xmlns:w16cex="http://schemas.microsoft.com/office/word/2018/wordml/cex" xmlns:w16cid="http://schemas.microsoft.com/office/word/2016/wordml/cid" xmlns:w16="http://schemas.microsoft.com/office/word/2018/wordml" xmlns:w16du="http://schemas.microsoft.com/office/word/2023/wordml/word16du" xmlns:w16sdtdh="http://schemas.microsoft.com/office/word/2020/wordml/sdtdatahash" xmlns:w16sdtfl="http://schemas.microsoft.com/office/word/2024/wordml/sdtformatlock" xmlns:w16se="http://schemas.microsoft.com/office/word/2015/wordml/symex" xmlns:wpg="http://schemas.microsoft.com/office/word/2010/wordprocessingGroup" xmlns:wpi="http://schemas.microsoft.com/office/word/2010/wordprocessingInk" xmlns:wne="http://schemas.microsoft.com/office/word/2006/wordml" xmlns:wps="http://schemas.microsoft.com/office/word/2010/wordprocessingShape" mc:Ignorable="w14 w15 w16se w16cid w16 w16cex w16sdtdh w16sdtfl w16du wp14">
   <w:p>
     <w:pPr>
-      <w:pStyle w:val="Header"/>
+      <w:pStyle w:val="Encabezado"/>
     </w:pPr>
   </w:p>
 </w:hdr>
@@ -742,62 +1312,8 @@
 <w:hdr xmlns:wpc="http://schemas.microsoft.com/office/word/2010/wordprocessingCanvas" xmlns:cx="http://schemas.microsoft.com/office/drawing/2014/chartex" xmlns:cx1="http://schemas.microsoft.com/office/drawing/2015/9/8/chartex" xmlns:cx2="http://schemas.microsoft.com/office/drawing/2015/10/21/chartex" xmlns:cx3="http://schemas.microsoft.com/office/drawing/2016/5/9/chartex" xmlns:cx4="http://schemas.microsoft.com/office/drawing/2016/5/10/chartex" xmlns:cx5="http://schemas.microsoft.com/office/drawing/2016/5/11/chartex" xmlns:cx6="http://schemas.microsoft.com/office/drawing/2016/5/12/chartex" xmlns:cx7="http://schemas.microsoft.com/office/drawing/2016/5/13/chartex" xmlns:cx8="http://schemas.microsoft.com/office/drawing/2016/5/14/chartex" xmlns:mc="http://schemas.openxmlformats.org/markup-compatibility/2006" xmlns:aink="http://schemas.microsoft.com/office/drawing/2016/ink" xmlns:am3d="http://schemas.microsoft.com/office/drawing/2017/model3d" xmlns:o="urn:schemas-microsoft-com:office:office" xmlns:oel="http://schemas.microsoft.com/office/2019/extlst" xmlns:r="http://schemas.openxmlformats.org/officeDocument/2006/relationships" xmlns:m="http://schemas.openxmlformats.org/officeDocument/2006/math" xmlns:v="urn:schemas-microsoft-com:vml" xmlns:wp14="http://schemas.microsoft.com/office/word/2010/wordprocessingDrawing" xmlns:wp="http://schemas.openxmlformats.org/drawingml/2006/wordprocessingDrawing" xmlns:w10="urn:schemas-microsoft-com:office:word" xmlns:w="http://schemas.openxmlformats.org/wordprocessingml/2006/main" xmlns:w14="http://schemas.microsoft.com/office/word/2010/wordml" xmlns:w15="http://schemas.microsoft.com/office/word/2012/wordml" xmlns:w16cex="http://schemas.microsoft.com/office/word/2018/wordml/cex" xmlns:w16cid="http://schemas.microsoft.com/office/word/2016/wordml/cid" xmlns:w16="http://schemas.microsoft.com/office/word/2018/wordml" xmlns:w16du="http://schemas.microsoft.com/office/word/2023/wordml/word16du" xmlns:w16sdtdh="http://schemas.microsoft.com/office/word/2020/wordml/sdtdatahash" xmlns:w16sdtfl="http://schemas.microsoft.com/office/word/2024/wordml/sdtformatlock" xmlns:w16se="http://schemas.microsoft.com/office/word/2015/wordml/symex" xmlns:wpg="http://schemas.microsoft.com/office/word/2010/wordprocessingGroup" xmlns:wpi="http://schemas.microsoft.com/office/word/2010/wordprocessingInk" xmlns:wne="http://schemas.microsoft.com/office/word/2006/wordml" xmlns:wps="http://schemas.microsoft.com/office/word/2010/wordprocessingShape" mc:Ignorable="w14 w15 w16se w16cid w16 w16cex w16sdtdh w16sdtfl w16du wp14">
   <w:p>
     <w:pPr>
-      <w:pStyle w:val="Header"/>
-    </w:pPr>
-    <w:r>
-      <w:rPr>
-        <w:noProof/>
-      </w:rPr>
-      <w:drawing>
-        <wp:anchor distT="0" distB="0" distL="114300" distR="114300" simplePos="0" relativeHeight="251658240" behindDoc="1" locked="0" layoutInCell="1" allowOverlap="1" wp14:anchorId="06028172" wp14:editId="42163A3A">
-          <wp:simplePos x="0" y="0"/>
-          <wp:positionH relativeFrom="column">
-            <wp:posOffset>-678180</wp:posOffset>
-          </wp:positionH>
-          <wp:positionV relativeFrom="paragraph">
-            <wp:posOffset>-459740</wp:posOffset>
-          </wp:positionV>
-          <wp:extent cx="7648575" cy="6381048"/>
-          <wp:effectExtent l="0" t="0" r="0" b="1270"/>
-          <wp:wrapNone/>
-          <wp:docPr id="1244663484" name="Picture 2"/>
-          <wp:cNvGraphicFramePr>
-            <a:graphicFrameLocks xmlns:a="http://schemas.openxmlformats.org/drawingml/2006/main" noChangeAspect="1"/>
-          </wp:cNvGraphicFramePr>
-          <a:graphic xmlns:a="http://schemas.openxmlformats.org/drawingml/2006/main">
-            <a:graphicData uri="http://schemas.openxmlformats.org/drawingml/2006/picture">
-              <pic:pic xmlns:pic="http://schemas.openxmlformats.org/drawingml/2006/picture">
-                <pic:nvPicPr>
-                  <pic:cNvPr id="1244663484" name="Picture 1244663484"/>
-                  <pic:cNvPicPr/>
-                </pic:nvPicPr>
-                <pic:blipFill>
-                  <a:blip r:embed="rId1"/>
-                  <a:stretch>
-                    <a:fillRect/>
-                  </a:stretch>
-                </pic:blipFill>
-                <pic:spPr>
-                  <a:xfrm>
-                    <a:off x="0" y="0"/>
-                    <a:ext cx="7648575" cy="6381048"/>
-                  </a:xfrm>
-                  <a:prstGeom prst="rect">
-                    <a:avLst/>
-                  </a:prstGeom>
-                </pic:spPr>
-              </pic:pic>
-            </a:graphicData>
-          </a:graphic>
-          <wp14:sizeRelH relativeFrom="margin">
-            <wp14:pctWidth>0</wp14:pctWidth>
-          </wp14:sizeRelH>
-          <wp14:sizeRelV relativeFrom="margin">
-            <wp14:pctHeight>0</wp14:pctHeight>
-          </wp14:sizeRelV>
-        </wp:anchor>
-      </w:drawing>
-    </w:r>
+      <w:pStyle w:val="Encabezado"/>
+    </w:pPr>
   </w:p>
 </w:hdr>
 </file>
@@ -806,7 +1322,7 @@
 <w:hdr xmlns:wpc="http://schemas.microsoft.com/office/word/2010/wordprocessingCanvas" xmlns:cx="http://schemas.microsoft.com/office/drawing/2014/chartex" xmlns:cx1="http://schemas.microsoft.com/office/drawing/2015/9/8/chartex" xmlns:cx2="http://schemas.microsoft.com/office/drawing/2015/10/21/chartex" xmlns:cx3="http://schemas.microsoft.com/office/drawing/2016/5/9/chartex" xmlns:cx4="http://schemas.microsoft.com/office/drawing/2016/5/10/chartex" xmlns:cx5="http://schemas.microsoft.com/office/drawing/2016/5/11/chartex" xmlns:cx6="http://schemas.microsoft.com/office/drawing/2016/5/12/chartex" xmlns:cx7="http://schemas.microsoft.com/office/drawing/2016/5/13/chartex" xmlns:cx8="http://schemas.microsoft.com/office/drawing/2016/5/14/chartex" xmlns:mc="http://schemas.openxmlformats.org/markup-compatibility/2006" xmlns:aink="http://schemas.microsoft.com/office/drawing/2016/ink" xmlns:am3d="http://schemas.microsoft.com/office/drawing/2017/model3d" xmlns:o="urn:schemas-microsoft-com:office:office" xmlns:oel="http://schemas.microsoft.com/office/2019/extlst" xmlns:r="http://schemas.openxmlformats.org/officeDocument/2006/relationships" xmlns:m="http://schemas.openxmlformats.org/officeDocument/2006/math" xmlns:v="urn:schemas-microsoft-com:vml" xmlns:wp14="http://schemas.microsoft.com/office/word/2010/wordprocessingDrawing" xmlns:wp="http://schemas.openxmlformats.org/drawingml/2006/wordprocessingDrawing" xmlns:w10="urn:schemas-microsoft-com:office:word" xmlns:w="http://schemas.openxmlformats.org/wordprocessingml/2006/main" xmlns:w14="http://schemas.microsoft.com/office/word/2010/wordml" xmlns:w15="http://schemas.microsoft.com/office/word/2012/wordml" xmlns:w16cex="http://schemas.microsoft.com/office/word/2018/wordml/cex" xmlns:w16cid="http://schemas.microsoft.com/office/word/2016/wordml/cid" xmlns:w16="http://schemas.microsoft.com/office/word/2018/wordml" xmlns:w16du="http://schemas.microsoft.com/office/word/2023/wordml/word16du" xmlns:w16sdtdh="http://schemas.microsoft.com/office/word/2020/wordml/sdtdatahash" xmlns:w16sdtfl="http://schemas.microsoft.com/office/word/2024/wordml/sdtformatlock" xmlns:w16se="http://schemas.microsoft.com/office/word/2015/wordml/symex" xmlns:wpg="http://schemas.microsoft.com/office/word/2010/wordprocessingGroup" xmlns:wpi="http://schemas.microsoft.com/office/word/2010/wordprocessingInk" xmlns:wne="http://schemas.microsoft.com/office/word/2006/wordml" xmlns:wps="http://schemas.microsoft.com/office/word/2010/wordprocessingShape" mc:Ignorable="w14 w15 w16se w16cid w16 w16cex w16sdtdh w16sdtfl w16du wp14">
   <w:p>
     <w:pPr>
-      <w:pStyle w:val="Header"/>
+      <w:pStyle w:val="Encabezado"/>
     </w:pPr>
   </w:p>
 </w:hdr>
@@ -855,7 +1371,7 @@
     <w:lvl w:ilvl="0">
       <w:start w:val="1"/>
       <w:numFmt w:val="decimal"/>
-      <w:pStyle w:val="ListNumber3"/>
+      <w:pStyle w:val="Listaconnmeros3"/>
       <w:lvlText w:val="%1."/>
       <w:lvlJc w:val="left"/>
       <w:pPr>
@@ -873,7 +1389,7 @@
     <w:lvl w:ilvl="0">
       <w:start w:val="1"/>
       <w:numFmt w:val="decimal"/>
-      <w:pStyle w:val="ListNumber2"/>
+      <w:pStyle w:val="Listaconnmeros2"/>
       <w:lvlText w:val="%1."/>
       <w:lvlJc w:val="left"/>
       <w:pPr>
@@ -911,7 +1427,7 @@
     <w:lvl w:ilvl="0">
       <w:start w:val="1"/>
       <w:numFmt w:val="bullet"/>
-      <w:pStyle w:val="ListBullet3"/>
+      <w:pStyle w:val="Listaconvietas3"/>
       <w:lvlText w:val=""/>
       <w:lvlJc w:val="left"/>
       <w:pPr>
@@ -932,7 +1448,7 @@
     <w:lvl w:ilvl="0">
       <w:start w:val="1"/>
       <w:numFmt w:val="bullet"/>
-      <w:pStyle w:val="ListBullet2"/>
+      <w:pStyle w:val="Listaconvietas2"/>
       <w:lvlText w:val=""/>
       <w:lvlJc w:val="left"/>
       <w:pPr>
@@ -953,7 +1469,7 @@
     <w:lvl w:ilvl="0">
       <w:start w:val="1"/>
       <w:numFmt w:val="decimal"/>
-      <w:pStyle w:val="ListNumber"/>
+      <w:pStyle w:val="Listaconnmeros"/>
       <w:lvlText w:val="%1."/>
       <w:lvlJc w:val="left"/>
       <w:pPr>
@@ -971,7 +1487,7 @@
     <w:lvl w:ilvl="0">
       <w:start w:val="1"/>
       <w:numFmt w:val="bullet"/>
-      <w:pStyle w:val="ListBullet"/>
+      <w:pStyle w:val="Listaconvietas"/>
       <w:lvlText w:val=""/>
       <w:lvlJc w:val="left"/>
       <w:pPr>
@@ -1413,11 +1929,11 @@
       <w:sz w:val="20"/>
     </w:rPr>
   </w:style>
-  <w:style w:type="paragraph" w:styleId="Heading1">
+  <w:style w:type="paragraph" w:styleId="Ttulo1">
     <w:name w:val="heading 1"/>
     <w:basedOn w:val="Normal"/>
     <w:next w:val="Normal"/>
-    <w:link w:val="Heading1Char"/>
+    <w:link w:val="Ttulo1Car"/>
     <w:uiPriority w:val="9"/>
     <w:qFormat/>
     <w:rsid w:val="00FC693F"/>
@@ -1436,11 +1952,11 @@
       <w:szCs w:val="28"/>
     </w:rPr>
   </w:style>
-  <w:style w:type="paragraph" w:styleId="Heading2">
+  <w:style w:type="paragraph" w:styleId="Ttulo2">
     <w:name w:val="heading 2"/>
     <w:basedOn w:val="Normal"/>
     <w:next w:val="Normal"/>
-    <w:link w:val="Heading2Char"/>
+    <w:link w:val="Ttulo2Car"/>
     <w:uiPriority w:val="9"/>
     <w:unhideWhenUsed/>
     <w:qFormat/>
@@ -1460,11 +1976,11 @@
       <w:szCs w:val="26"/>
     </w:rPr>
   </w:style>
-  <w:style w:type="paragraph" w:styleId="Heading3">
+  <w:style w:type="paragraph" w:styleId="Ttulo3">
     <w:name w:val="heading 3"/>
     <w:basedOn w:val="Normal"/>
     <w:next w:val="Normal"/>
-    <w:link w:val="Heading3Char"/>
+    <w:link w:val="Ttulo3Car"/>
     <w:uiPriority w:val="9"/>
     <w:unhideWhenUsed/>
     <w:qFormat/>
@@ -1482,11 +1998,11 @@
       <w:color w:val="4F81BD" w:themeColor="accent1"/>
     </w:rPr>
   </w:style>
-  <w:style w:type="paragraph" w:styleId="Heading4">
+  <w:style w:type="paragraph" w:styleId="Ttulo4">
     <w:name w:val="heading 4"/>
     <w:basedOn w:val="Normal"/>
     <w:next w:val="Normal"/>
-    <w:link w:val="Heading4Char"/>
+    <w:link w:val="Ttulo4Car"/>
     <w:uiPriority w:val="9"/>
     <w:semiHidden/>
     <w:unhideWhenUsed/>
@@ -1507,11 +2023,11 @@
       <w:color w:val="4F81BD" w:themeColor="accent1"/>
     </w:rPr>
   </w:style>
-  <w:style w:type="paragraph" w:styleId="Heading5">
+  <w:style w:type="paragraph" w:styleId="Ttulo5">
     <w:name w:val="heading 5"/>
     <w:basedOn w:val="Normal"/>
     <w:next w:val="Normal"/>
-    <w:link w:val="Heading5Char"/>
+    <w:link w:val="Ttulo5Car"/>
     <w:uiPriority w:val="9"/>
     <w:semiHidden/>
     <w:unhideWhenUsed/>
@@ -1528,11 +2044,11 @@
       <w:color w:val="243F60" w:themeColor="accent1" w:themeShade="7F"/>
     </w:rPr>
   </w:style>
-  <w:style w:type="paragraph" w:styleId="Heading6">
+  <w:style w:type="paragraph" w:styleId="Ttulo6">
     <w:name w:val="heading 6"/>
     <w:basedOn w:val="Normal"/>
     <w:next w:val="Normal"/>
-    <w:link w:val="Heading6Char"/>
+    <w:link w:val="Ttulo6Car"/>
     <w:uiPriority w:val="9"/>
     <w:semiHidden/>
     <w:unhideWhenUsed/>
@@ -1551,11 +2067,11 @@
       <w:color w:val="243F60" w:themeColor="accent1" w:themeShade="7F"/>
     </w:rPr>
   </w:style>
-  <w:style w:type="paragraph" w:styleId="Heading7">
+  <w:style w:type="paragraph" w:styleId="Ttulo7">
     <w:name w:val="heading 7"/>
     <w:basedOn w:val="Normal"/>
     <w:next w:val="Normal"/>
-    <w:link w:val="Heading7Char"/>
+    <w:link w:val="Ttulo7Car"/>
     <w:uiPriority w:val="9"/>
     <w:semiHidden/>
     <w:unhideWhenUsed/>
@@ -1574,11 +2090,11 @@
       <w:color w:val="404040" w:themeColor="text1" w:themeTint="BF"/>
     </w:rPr>
   </w:style>
-  <w:style w:type="paragraph" w:styleId="Heading8">
+  <w:style w:type="paragraph" w:styleId="Ttulo8">
     <w:name w:val="heading 8"/>
     <w:basedOn w:val="Normal"/>
     <w:next w:val="Normal"/>
-    <w:link w:val="Heading8Char"/>
+    <w:link w:val="Ttulo8Car"/>
     <w:uiPriority w:val="9"/>
     <w:semiHidden/>
     <w:unhideWhenUsed/>
@@ -1596,11 +2112,11 @@
       <w:szCs w:val="20"/>
     </w:rPr>
   </w:style>
-  <w:style w:type="paragraph" w:styleId="Heading9">
+  <w:style w:type="paragraph" w:styleId="Ttulo9">
     <w:name w:val="heading 9"/>
     <w:basedOn w:val="Normal"/>
     <w:next w:val="Normal"/>
-    <w:link w:val="Heading9Char"/>
+    <w:link w:val="Ttulo9Car"/>
     <w:uiPriority w:val="9"/>
     <w:semiHidden/>
     <w:unhideWhenUsed/>
@@ -1620,13 +2136,13 @@
       <w:szCs w:val="20"/>
     </w:rPr>
   </w:style>
-  <w:style w:type="character" w:default="1" w:styleId="DefaultParagraphFont">
+  <w:style w:type="character" w:default="1" w:styleId="Fuentedeprrafopredeter">
     <w:name w:val="Default Paragraph Font"/>
     <w:uiPriority w:val="1"/>
     <w:semiHidden/>
     <w:unhideWhenUsed/>
   </w:style>
-  <w:style w:type="table" w:default="1" w:styleId="TableNormal">
+  <w:style w:type="table" w:default="1" w:styleId="Tablanormal">
     <w:name w:val="Normal Table"/>
     <w:uiPriority w:val="99"/>
     <w:semiHidden/>
@@ -1641,16 +2157,16 @@
       </w:tblCellMar>
     </w:tblPr>
   </w:style>
-  <w:style w:type="numbering" w:default="1" w:styleId="NoList">
+  <w:style w:type="numbering" w:default="1" w:styleId="Sinlista">
     <w:name w:val="No List"/>
     <w:uiPriority w:val="99"/>
     <w:semiHidden/>
     <w:unhideWhenUsed/>
   </w:style>
-  <w:style w:type="paragraph" w:styleId="Header">
+  <w:style w:type="paragraph" w:styleId="Encabezado">
     <w:name w:val="header"/>
     <w:basedOn w:val="Normal"/>
-    <w:link w:val="HeaderChar"/>
+    <w:link w:val="EncabezadoCar"/>
     <w:uiPriority w:val="99"/>
     <w:unhideWhenUsed/>
     <w:rsid w:val="00E618BF"/>
@@ -1662,17 +2178,17 @@
       <w:spacing w:line="240" w:lineRule="auto"/>
     </w:pPr>
   </w:style>
-  <w:style w:type="character" w:customStyle="1" w:styleId="HeaderChar">
-    <w:name w:val="Header Char"/>
-    <w:basedOn w:val="DefaultParagraphFont"/>
-    <w:link w:val="Header"/>
+  <w:style w:type="character" w:customStyle="1" w:styleId="EncabezadoCar">
+    <w:name w:val="Encabezado Car"/>
+    <w:basedOn w:val="Fuentedeprrafopredeter"/>
+    <w:link w:val="Encabezado"/>
     <w:uiPriority w:val="99"/>
     <w:rsid w:val="00E618BF"/>
   </w:style>
-  <w:style w:type="paragraph" w:styleId="Footer">
+  <w:style w:type="paragraph" w:styleId="Piedepgina">
     <w:name w:val="footer"/>
     <w:basedOn w:val="Normal"/>
-    <w:link w:val="FooterChar"/>
+    <w:link w:val="PiedepginaCar"/>
     <w:uiPriority w:val="99"/>
     <w:unhideWhenUsed/>
     <w:rsid w:val="00E618BF"/>
@@ -1684,14 +2200,14 @@
       <w:spacing w:line="240" w:lineRule="auto"/>
     </w:pPr>
   </w:style>
-  <w:style w:type="character" w:customStyle="1" w:styleId="FooterChar">
-    <w:name w:val="Footer Char"/>
-    <w:basedOn w:val="DefaultParagraphFont"/>
-    <w:link w:val="Footer"/>
+  <w:style w:type="character" w:customStyle="1" w:styleId="PiedepginaCar">
+    <w:name w:val="Pie de página Car"/>
+    <w:basedOn w:val="Fuentedeprrafopredeter"/>
+    <w:link w:val="Piedepgina"/>
     <w:uiPriority w:val="99"/>
     <w:rsid w:val="00E618BF"/>
   </w:style>
-  <w:style w:type="paragraph" w:styleId="NoSpacing">
+  <w:style w:type="paragraph" w:styleId="Sinespaciado">
     <w:name w:val="No Spacing"/>
     <w:uiPriority w:val="1"/>
     <w:qFormat/>
@@ -1700,10 +2216,10 @@
       <w:spacing w:after="0" w:line="240" w:lineRule="auto"/>
     </w:pPr>
   </w:style>
-  <w:style w:type="character" w:customStyle="1" w:styleId="Heading1Char">
-    <w:name w:val="Heading 1 Char"/>
-    <w:basedOn w:val="DefaultParagraphFont"/>
-    <w:link w:val="Heading1"/>
+  <w:style w:type="character" w:customStyle="1" w:styleId="Ttulo1Car">
+    <w:name w:val="Título 1 Car"/>
+    <w:basedOn w:val="Fuentedeprrafopredeter"/>
+    <w:link w:val="Ttulo1"/>
     <w:uiPriority w:val="9"/>
     <w:rsid w:val="00FC693F"/>
     <w:rPr>
@@ -1715,10 +2231,10 @@
       <w:szCs w:val="28"/>
     </w:rPr>
   </w:style>
-  <w:style w:type="character" w:customStyle="1" w:styleId="Heading2Char">
-    <w:name w:val="Heading 2 Char"/>
-    <w:basedOn w:val="DefaultParagraphFont"/>
-    <w:link w:val="Heading2"/>
+  <w:style w:type="character" w:customStyle="1" w:styleId="Ttulo2Car">
+    <w:name w:val="Título 2 Car"/>
+    <w:basedOn w:val="Fuentedeprrafopredeter"/>
+    <w:link w:val="Ttulo2"/>
     <w:uiPriority w:val="9"/>
     <w:rsid w:val="00FC693F"/>
     <w:rPr>
@@ -1730,10 +2246,10 @@
       <w:szCs w:val="26"/>
     </w:rPr>
   </w:style>
-  <w:style w:type="character" w:customStyle="1" w:styleId="Heading3Char">
-    <w:name w:val="Heading 3 Char"/>
-    <w:basedOn w:val="DefaultParagraphFont"/>
-    <w:link w:val="Heading3"/>
+  <w:style w:type="character" w:customStyle="1" w:styleId="Ttulo3Car">
+    <w:name w:val="Título 3 Car"/>
+    <w:basedOn w:val="Fuentedeprrafopredeter"/>
+    <w:link w:val="Ttulo3"/>
     <w:uiPriority w:val="9"/>
     <w:rsid w:val="00FC693F"/>
     <w:rPr>
@@ -1743,11 +2259,11 @@
       <w:color w:val="4F81BD" w:themeColor="accent1"/>
     </w:rPr>
   </w:style>
-  <w:style w:type="paragraph" w:styleId="Title">
+  <w:style w:type="paragraph" w:styleId="Ttulo">
     <w:name w:val="Title"/>
     <w:basedOn w:val="Normal"/>
     <w:next w:val="Normal"/>
-    <w:link w:val="TitleChar"/>
+    <w:link w:val="TtuloCar"/>
     <w:uiPriority w:val="10"/>
     <w:qFormat/>
     <w:rsid w:val="00FC693F"/>
@@ -1767,10 +2283,10 @@
       <w:szCs w:val="52"/>
     </w:rPr>
   </w:style>
-  <w:style w:type="character" w:customStyle="1" w:styleId="TitleChar">
-    <w:name w:val="Title Char"/>
-    <w:basedOn w:val="DefaultParagraphFont"/>
-    <w:link w:val="Title"/>
+  <w:style w:type="character" w:customStyle="1" w:styleId="TtuloCar">
+    <w:name w:val="Título Car"/>
+    <w:basedOn w:val="Fuentedeprrafopredeter"/>
+    <w:link w:val="Ttulo"/>
     <w:uiPriority w:val="10"/>
     <w:rsid w:val="00FC693F"/>
     <w:rPr>
@@ -1782,11 +2298,11 @@
       <w:szCs w:val="52"/>
     </w:rPr>
   </w:style>
-  <w:style w:type="paragraph" w:styleId="Subtitle">
+  <w:style w:type="paragraph" w:styleId="Subttulo">
     <w:name w:val="Subtitle"/>
     <w:basedOn w:val="Normal"/>
     <w:next w:val="Normal"/>
-    <w:link w:val="SubtitleChar"/>
+    <w:link w:val="SubttuloCar"/>
     <w:uiPriority w:val="11"/>
     <w:qFormat/>
     <w:rsid w:val="00FC693F"/>
@@ -1805,10 +2321,10 @@
       <w:szCs w:val="24"/>
     </w:rPr>
   </w:style>
-  <w:style w:type="character" w:customStyle="1" w:styleId="SubtitleChar">
-    <w:name w:val="Subtitle Char"/>
-    <w:basedOn w:val="DefaultParagraphFont"/>
-    <w:link w:val="Subtitle"/>
+  <w:style w:type="character" w:customStyle="1" w:styleId="SubttuloCar">
+    <w:name w:val="Subtítulo Car"/>
+    <w:basedOn w:val="Fuentedeprrafopredeter"/>
+    <w:link w:val="Subttulo"/>
     <w:uiPriority w:val="11"/>
     <w:rsid w:val="00FC693F"/>
     <w:rPr>
@@ -1821,7 +2337,7 @@
       <w:szCs w:val="24"/>
     </w:rPr>
   </w:style>
-  <w:style w:type="paragraph" w:styleId="ListParagraph">
+  <w:style w:type="paragraph" w:styleId="Prrafodelista">
     <w:name w:val="List Paragraph"/>
     <w:basedOn w:val="Normal"/>
     <w:uiPriority w:val="34"/>
@@ -1832,10 +2348,10 @@
       <w:contextualSpacing/>
     </w:pPr>
   </w:style>
-  <w:style w:type="paragraph" w:styleId="BodyText">
+  <w:style w:type="paragraph" w:styleId="Textoindependiente">
     <w:name w:val="Body Text"/>
     <w:basedOn w:val="Normal"/>
-    <w:link w:val="BodyTextChar"/>
+    <w:link w:val="TextoindependienteCar"/>
     <w:uiPriority w:val="99"/>
     <w:unhideWhenUsed/>
     <w:rsid w:val="00AA1D8D"/>
@@ -1843,17 +2359,17 @@
       <w:spacing w:after="120"/>
     </w:pPr>
   </w:style>
-  <w:style w:type="character" w:customStyle="1" w:styleId="BodyTextChar">
-    <w:name w:val="Body Text Char"/>
-    <w:basedOn w:val="DefaultParagraphFont"/>
-    <w:link w:val="BodyText"/>
+  <w:style w:type="character" w:customStyle="1" w:styleId="TextoindependienteCar">
+    <w:name w:val="Texto independiente Car"/>
+    <w:basedOn w:val="Fuentedeprrafopredeter"/>
+    <w:link w:val="Textoindependiente"/>
     <w:uiPriority w:val="99"/>
     <w:rsid w:val="00AA1D8D"/>
   </w:style>
-  <w:style w:type="paragraph" w:styleId="BodyText2">
+  <w:style w:type="paragraph" w:styleId="Textoindependiente2">
     <w:name w:val="Body Text 2"/>
     <w:basedOn w:val="Normal"/>
-    <w:link w:val="BodyText2Char"/>
+    <w:link w:val="Textoindependiente2Car"/>
     <w:uiPriority w:val="99"/>
     <w:unhideWhenUsed/>
     <w:rsid w:val="00AA1D8D"/>
@@ -1861,17 +2377,17 @@
       <w:spacing w:after="120" w:line="480" w:lineRule="auto"/>
     </w:pPr>
   </w:style>
-  <w:style w:type="character" w:customStyle="1" w:styleId="BodyText2Char">
-    <w:name w:val="Body Text 2 Char"/>
-    <w:basedOn w:val="DefaultParagraphFont"/>
-    <w:link w:val="BodyText2"/>
+  <w:style w:type="character" w:customStyle="1" w:styleId="Textoindependiente2Car">
+    <w:name w:val="Texto independiente 2 Car"/>
+    <w:basedOn w:val="Fuentedeprrafopredeter"/>
+    <w:link w:val="Textoindependiente2"/>
     <w:uiPriority w:val="99"/>
     <w:rsid w:val="00AA1D8D"/>
   </w:style>
-  <w:style w:type="paragraph" w:styleId="BodyText3">
+  <w:style w:type="paragraph" w:styleId="Textoindependiente3">
     <w:name w:val="Body Text 3"/>
     <w:basedOn w:val="Normal"/>
-    <w:link w:val="BodyText3Char"/>
+    <w:link w:val="Textoindependiente3Car"/>
     <w:uiPriority w:val="99"/>
     <w:unhideWhenUsed/>
     <w:rsid w:val="00AA1D8D"/>
@@ -1883,10 +2399,10 @@
       <w:szCs w:val="16"/>
     </w:rPr>
   </w:style>
-  <w:style w:type="character" w:customStyle="1" w:styleId="BodyText3Char">
-    <w:name w:val="Body Text 3 Char"/>
-    <w:basedOn w:val="DefaultParagraphFont"/>
-    <w:link w:val="BodyText3"/>
+  <w:style w:type="character" w:customStyle="1" w:styleId="Textoindependiente3Car">
+    <w:name w:val="Texto independiente 3 Car"/>
+    <w:basedOn w:val="Fuentedeprrafopredeter"/>
+    <w:link w:val="Textoindependiente3"/>
     <w:uiPriority w:val="99"/>
     <w:rsid w:val="00AA1D8D"/>
     <w:rPr>
@@ -1894,7 +2410,7 @@
       <w:szCs w:val="16"/>
     </w:rPr>
   </w:style>
-  <w:style w:type="paragraph" w:styleId="List">
+  <w:style w:type="paragraph" w:styleId="Lista">
     <w:name w:val="List"/>
     <w:basedOn w:val="Normal"/>
     <w:uiPriority w:val="99"/>
@@ -1905,7 +2421,7 @@
       <w:contextualSpacing/>
     </w:pPr>
   </w:style>
-  <w:style w:type="paragraph" w:styleId="List2">
+  <w:style w:type="paragraph" w:styleId="Lista2">
     <w:name w:val="List 2"/>
     <w:basedOn w:val="Normal"/>
     <w:uiPriority w:val="99"/>
@@ -1916,7 +2432,7 @@
       <w:contextualSpacing/>
     </w:pPr>
   </w:style>
-  <w:style w:type="paragraph" w:styleId="List3">
+  <w:style w:type="paragraph" w:styleId="Lista3">
     <w:name w:val="List 3"/>
     <w:basedOn w:val="Normal"/>
     <w:uiPriority w:val="99"/>
@@ -1927,7 +2443,7 @@
       <w:contextualSpacing/>
     </w:pPr>
   </w:style>
-  <w:style w:type="paragraph" w:styleId="ListBullet">
+  <w:style w:type="paragraph" w:styleId="Listaconvietas">
     <w:name w:val="List Bullet"/>
     <w:basedOn w:val="Normal"/>
     <w:uiPriority w:val="99"/>
@@ -1940,7 +2456,7 @@
       <w:contextualSpacing/>
     </w:pPr>
   </w:style>
-  <w:style w:type="paragraph" w:styleId="ListBullet2">
+  <w:style w:type="paragraph" w:styleId="Listaconvietas2">
     <w:name w:val="List Bullet 2"/>
     <w:basedOn w:val="Normal"/>
     <w:uiPriority w:val="99"/>
@@ -1953,7 +2469,7 @@
       <w:contextualSpacing/>
     </w:pPr>
   </w:style>
-  <w:style w:type="paragraph" w:styleId="ListBullet3">
+  <w:style w:type="paragraph" w:styleId="Listaconvietas3">
     <w:name w:val="List Bullet 3"/>
     <w:basedOn w:val="Normal"/>
     <w:uiPriority w:val="99"/>
@@ -1966,7 +2482,7 @@
       <w:contextualSpacing/>
     </w:pPr>
   </w:style>
-  <w:style w:type="paragraph" w:styleId="ListNumber">
+  <w:style w:type="paragraph" w:styleId="Listaconnmeros">
     <w:name w:val="List Number"/>
     <w:basedOn w:val="Normal"/>
     <w:uiPriority w:val="99"/>
@@ -1979,7 +2495,7 @@
       <w:contextualSpacing/>
     </w:pPr>
   </w:style>
-  <w:style w:type="paragraph" w:styleId="ListNumber2">
+  <w:style w:type="paragraph" w:styleId="Listaconnmeros2">
     <w:name w:val="List Number 2"/>
     <w:basedOn w:val="Normal"/>
     <w:uiPriority w:val="99"/>
@@ -1992,7 +2508,7 @@
       <w:contextualSpacing/>
     </w:pPr>
   </w:style>
-  <w:style w:type="paragraph" w:styleId="ListNumber3">
+  <w:style w:type="paragraph" w:styleId="Listaconnmeros3">
     <w:name w:val="List Number 3"/>
     <w:basedOn w:val="Normal"/>
     <w:uiPriority w:val="99"/>
@@ -2005,7 +2521,7 @@
       <w:contextualSpacing/>
     </w:pPr>
   </w:style>
-  <w:style w:type="paragraph" w:styleId="ListContinue">
+  <w:style w:type="paragraph" w:styleId="Continuarlista">
     <w:name w:val="List Continue"/>
     <w:basedOn w:val="Normal"/>
     <w:uiPriority w:val="99"/>
@@ -2017,7 +2533,7 @@
       <w:contextualSpacing/>
     </w:pPr>
   </w:style>
-  <w:style w:type="paragraph" w:styleId="ListContinue2">
+  <w:style w:type="paragraph" w:styleId="Continuarlista2">
     <w:name w:val="List Continue 2"/>
     <w:basedOn w:val="Normal"/>
     <w:uiPriority w:val="99"/>
@@ -2029,7 +2545,7 @@
       <w:contextualSpacing/>
     </w:pPr>
   </w:style>
-  <w:style w:type="paragraph" w:styleId="ListContinue3">
+  <w:style w:type="paragraph" w:styleId="Continuarlista3">
     <w:name w:val="List Continue 3"/>
     <w:basedOn w:val="Normal"/>
     <w:uiPriority w:val="99"/>
@@ -2041,9 +2557,9 @@
       <w:contextualSpacing/>
     </w:pPr>
   </w:style>
-  <w:style w:type="paragraph" w:styleId="MacroText">
+  <w:style w:type="paragraph" w:styleId="Textomacro">
     <w:name w:val="macro"/>
-    <w:link w:val="MacroTextChar"/>
+    <w:link w:val="TextomacroCar"/>
     <w:uiPriority w:val="99"/>
     <w:unhideWhenUsed/>
     <w:rsid w:val="0029639D"/>
@@ -2064,10 +2580,10 @@
       <w:szCs w:val="20"/>
     </w:rPr>
   </w:style>
-  <w:style w:type="character" w:customStyle="1" w:styleId="MacroTextChar">
-    <w:name w:val="Macro Text Char"/>
-    <w:basedOn w:val="DefaultParagraphFont"/>
-    <w:link w:val="MacroText"/>
+  <w:style w:type="character" w:customStyle="1" w:styleId="TextomacroCar">
+    <w:name w:val="Texto macro Car"/>
+    <w:basedOn w:val="Fuentedeprrafopredeter"/>
+    <w:link w:val="Textomacro"/>
     <w:uiPriority w:val="99"/>
     <w:rsid w:val="0029639D"/>
     <w:rPr>
@@ -2076,11 +2592,11 @@
       <w:szCs w:val="20"/>
     </w:rPr>
   </w:style>
-  <w:style w:type="paragraph" w:styleId="Quote">
+  <w:style w:type="paragraph" w:styleId="Cita">
     <w:name w:val="Quote"/>
     <w:basedOn w:val="Normal"/>
     <w:next w:val="Normal"/>
-    <w:link w:val="QuoteChar"/>
+    <w:link w:val="CitaCar"/>
     <w:uiPriority w:val="29"/>
     <w:qFormat/>
     <w:rsid w:val="00FC693F"/>
@@ -2090,10 +2606,10 @@
       <w:color w:val="000000" w:themeColor="text1"/>
     </w:rPr>
   </w:style>
-  <w:style w:type="character" w:customStyle="1" w:styleId="QuoteChar">
-    <w:name w:val="Quote Char"/>
-    <w:basedOn w:val="DefaultParagraphFont"/>
-    <w:link w:val="Quote"/>
+  <w:style w:type="character" w:customStyle="1" w:styleId="CitaCar">
+    <w:name w:val="Cita Car"/>
+    <w:basedOn w:val="Fuentedeprrafopredeter"/>
+    <w:link w:val="Cita"/>
     <w:uiPriority w:val="29"/>
     <w:rsid w:val="00FC693F"/>
     <w:rPr>
@@ -2102,10 +2618,10 @@
       <w:color w:val="000000" w:themeColor="text1"/>
     </w:rPr>
   </w:style>
-  <w:style w:type="character" w:customStyle="1" w:styleId="Heading4Char">
-    <w:name w:val="Heading 4 Char"/>
-    <w:basedOn w:val="DefaultParagraphFont"/>
-    <w:link w:val="Heading4"/>
+  <w:style w:type="character" w:customStyle="1" w:styleId="Ttulo4Car">
+    <w:name w:val="Título 4 Car"/>
+    <w:basedOn w:val="Fuentedeprrafopredeter"/>
+    <w:link w:val="Ttulo4"/>
     <w:uiPriority w:val="9"/>
     <w:semiHidden/>
     <w:rsid w:val="00FC693F"/>
@@ -2118,10 +2634,10 @@
       <w:color w:val="4F81BD" w:themeColor="accent1"/>
     </w:rPr>
   </w:style>
-  <w:style w:type="character" w:customStyle="1" w:styleId="Heading5Char">
-    <w:name w:val="Heading 5 Char"/>
-    <w:basedOn w:val="DefaultParagraphFont"/>
-    <w:link w:val="Heading5"/>
+  <w:style w:type="character" w:customStyle="1" w:styleId="Ttulo5Car">
+    <w:name w:val="Título 5 Car"/>
+    <w:basedOn w:val="Fuentedeprrafopredeter"/>
+    <w:link w:val="Ttulo5"/>
     <w:uiPriority w:val="9"/>
     <w:semiHidden/>
     <w:rsid w:val="00FC693F"/>
@@ -2130,10 +2646,10 @@
       <w:color w:val="243F60" w:themeColor="accent1" w:themeShade="7F"/>
     </w:rPr>
   </w:style>
-  <w:style w:type="character" w:customStyle="1" w:styleId="Heading6Char">
-    <w:name w:val="Heading 6 Char"/>
-    <w:basedOn w:val="DefaultParagraphFont"/>
-    <w:link w:val="Heading6"/>
+  <w:style w:type="character" w:customStyle="1" w:styleId="Ttulo6Car">
+    <w:name w:val="Título 6 Car"/>
+    <w:basedOn w:val="Fuentedeprrafopredeter"/>
+    <w:link w:val="Ttulo6"/>
     <w:uiPriority w:val="9"/>
     <w:semiHidden/>
     <w:rsid w:val="00FC693F"/>
@@ -2144,10 +2660,10 @@
       <w:color w:val="243F60" w:themeColor="accent1" w:themeShade="7F"/>
     </w:rPr>
   </w:style>
-  <w:style w:type="character" w:customStyle="1" w:styleId="Heading7Char">
-    <w:name w:val="Heading 7 Char"/>
-    <w:basedOn w:val="DefaultParagraphFont"/>
-    <w:link w:val="Heading7"/>
+  <w:style w:type="character" w:customStyle="1" w:styleId="Ttulo7Car">
+    <w:name w:val="Título 7 Car"/>
+    <w:basedOn w:val="Fuentedeprrafopredeter"/>
+    <w:link w:val="Ttulo7"/>
     <w:uiPriority w:val="9"/>
     <w:semiHidden/>
     <w:rsid w:val="00FC693F"/>
@@ -2158,10 +2674,10 @@
       <w:color w:val="404040" w:themeColor="text1" w:themeTint="BF"/>
     </w:rPr>
   </w:style>
-  <w:style w:type="character" w:customStyle="1" w:styleId="Heading8Char">
-    <w:name w:val="Heading 8 Char"/>
-    <w:basedOn w:val="DefaultParagraphFont"/>
-    <w:link w:val="Heading8"/>
+  <w:style w:type="character" w:customStyle="1" w:styleId="Ttulo8Car">
+    <w:name w:val="Título 8 Car"/>
+    <w:basedOn w:val="Fuentedeprrafopredeter"/>
+    <w:link w:val="Ttulo8"/>
     <w:uiPriority w:val="9"/>
     <w:semiHidden/>
     <w:rsid w:val="00FC693F"/>
@@ -2172,10 +2688,10 @@
       <w:szCs w:val="20"/>
     </w:rPr>
   </w:style>
-  <w:style w:type="character" w:customStyle="1" w:styleId="Heading9Char">
-    <w:name w:val="Heading 9 Char"/>
-    <w:basedOn w:val="DefaultParagraphFont"/>
-    <w:link w:val="Heading9"/>
+  <w:style w:type="character" w:customStyle="1" w:styleId="Ttulo9Car">
+    <w:name w:val="Título 9 Car"/>
+    <w:basedOn w:val="Fuentedeprrafopredeter"/>
+    <w:link w:val="Ttulo9"/>
     <w:uiPriority w:val="9"/>
     <w:semiHidden/>
     <w:rsid w:val="00FC693F"/>
@@ -2188,7 +2704,7 @@
       <w:szCs w:val="20"/>
     </w:rPr>
   </w:style>
-  <w:style w:type="paragraph" w:styleId="Caption">
+  <w:style w:type="paragraph" w:styleId="Descripcin">
     <w:name w:val="caption"/>
     <w:basedOn w:val="Normal"/>
     <w:next w:val="Normal"/>
@@ -2208,9 +2724,9 @@
       <w:szCs w:val="18"/>
     </w:rPr>
   </w:style>
-  <w:style w:type="character" w:styleId="Strong">
+  <w:style w:type="character" w:styleId="Fuerte">
     <w:name w:val="Strong"/>
-    <w:basedOn w:val="DefaultParagraphFont"/>
+    <w:basedOn w:val="Fuentedeprrafopredeter"/>
     <w:uiPriority w:val="22"/>
     <w:qFormat/>
     <w:rsid w:val="00FC693F"/>
@@ -2219,9 +2735,9 @@
       <w:bCs/>
     </w:rPr>
   </w:style>
-  <w:style w:type="character" w:styleId="Emphasis">
+  <w:style w:type="character" w:styleId="nfasis">
     <w:name w:val="Emphasis"/>
-    <w:basedOn w:val="DefaultParagraphFont"/>
+    <w:basedOn w:val="Fuentedeprrafopredeter"/>
     <w:uiPriority w:val="20"/>
     <w:qFormat/>
     <w:rsid w:val="00FC693F"/>
@@ -2230,11 +2746,11 @@
       <w:iCs/>
     </w:rPr>
   </w:style>
-  <w:style w:type="paragraph" w:styleId="IntenseQuote">
+  <w:style w:type="paragraph" w:styleId="Citadestacada">
     <w:name w:val="Intense Quote"/>
     <w:basedOn w:val="Normal"/>
     <w:next w:val="Normal"/>
-    <w:link w:val="IntenseQuoteChar"/>
+    <w:link w:val="CitadestacadaCar"/>
     <w:uiPriority w:val="30"/>
     <w:qFormat/>
     <w:rsid w:val="00FC693F"/>
@@ -2253,10 +2769,10 @@
       <w:color w:val="4F81BD" w:themeColor="accent1"/>
     </w:rPr>
   </w:style>
-  <w:style w:type="character" w:customStyle="1" w:styleId="IntenseQuoteChar">
-    <w:name w:val="Intense Quote Char"/>
-    <w:basedOn w:val="DefaultParagraphFont"/>
-    <w:link w:val="IntenseQuote"/>
+  <w:style w:type="character" w:customStyle="1" w:styleId="CitadestacadaCar">
+    <w:name w:val="Cita destacada Car"/>
+    <w:basedOn w:val="Fuentedeprrafopredeter"/>
+    <w:link w:val="Citadestacada"/>
     <w:uiPriority w:val="30"/>
     <w:rsid w:val="00FC693F"/>
     <w:rPr>
@@ -2267,9 +2783,9 @@
       <w:color w:val="4F81BD" w:themeColor="accent1"/>
     </w:rPr>
   </w:style>
-  <w:style w:type="character" w:styleId="SubtleEmphasis">
+  <w:style w:type="character" w:styleId="nfasissutil">
     <w:name w:val="Subtle Emphasis"/>
-    <w:basedOn w:val="DefaultParagraphFont"/>
+    <w:basedOn w:val="Fuentedeprrafopredeter"/>
     <w:uiPriority w:val="19"/>
     <w:qFormat/>
     <w:rsid w:val="00FC693F"/>
@@ -2279,9 +2795,9 @@
       <w:color w:val="808080" w:themeColor="text1" w:themeTint="7F"/>
     </w:rPr>
   </w:style>
-  <w:style w:type="character" w:styleId="IntenseEmphasis">
+  <w:style w:type="character" w:styleId="nfasisintenso">
     <w:name w:val="Intense Emphasis"/>
-    <w:basedOn w:val="DefaultParagraphFont"/>
+    <w:basedOn w:val="Fuentedeprrafopredeter"/>
     <w:uiPriority w:val="21"/>
     <w:qFormat/>
     <w:rsid w:val="00FC693F"/>
@@ -2293,9 +2809,9 @@
       <w:color w:val="4F81BD" w:themeColor="accent1"/>
     </w:rPr>
   </w:style>
-  <w:style w:type="character" w:styleId="SubtleReference">
+  <w:style w:type="character" w:styleId="Referenciasutil">
     <w:name w:val="Subtle Reference"/>
-    <w:basedOn w:val="DefaultParagraphFont"/>
+    <w:basedOn w:val="Fuentedeprrafopredeter"/>
     <w:uiPriority w:val="31"/>
     <w:qFormat/>
     <w:rsid w:val="00FC693F"/>
@@ -2305,9 +2821,9 @@
       <w:u w:val="single"/>
     </w:rPr>
   </w:style>
-  <w:style w:type="character" w:styleId="IntenseReference">
+  <w:style w:type="character" w:styleId="Referenciaintensa">
     <w:name w:val="Intense Reference"/>
-    <w:basedOn w:val="DefaultParagraphFont"/>
+    <w:basedOn w:val="Fuentedeprrafopredeter"/>
     <w:uiPriority w:val="32"/>
     <w:qFormat/>
     <w:rsid w:val="00FC693F"/>
@@ -2320,9 +2836,9 @@
       <w:u w:val="single"/>
     </w:rPr>
   </w:style>
-  <w:style w:type="character" w:styleId="BookTitle">
+  <w:style w:type="character" w:styleId="Ttulodellibro">
     <w:name w:val="Book Title"/>
-    <w:basedOn w:val="DefaultParagraphFont"/>
+    <w:basedOn w:val="Fuentedeprrafopredeter"/>
     <w:uiPriority w:val="33"/>
     <w:qFormat/>
     <w:rsid w:val="00FC693F"/>
@@ -2333,9 +2849,9 @@
       <w:spacing w:val="5"/>
     </w:rPr>
   </w:style>
-  <w:style w:type="paragraph" w:styleId="TOCHeading">
+  <w:style w:type="paragraph" w:styleId="TtuloTDC">
     <w:name w:val="TOC Heading"/>
-    <w:basedOn w:val="Heading1"/>
+    <w:basedOn w:val="Ttulo1"/>
     <w:next w:val="Normal"/>
     <w:uiPriority w:val="39"/>
     <w:semiHidden/>
@@ -2346,9 +2862,9 @@
       <w:outlineLvl w:val="9"/>
     </w:pPr>
   </w:style>
-  <w:style w:type="table" w:styleId="TableGrid">
+  <w:style w:type="table" w:styleId="Tablaconcuadrcula">
     <w:name w:val="Table Grid"/>
-    <w:basedOn w:val="TableNormal"/>
+    <w:basedOn w:val="Tablanormal"/>
     <w:uiPriority w:val="59"/>
     <w:rsid w:val="00FC693F"/>
     <w:pPr>
@@ -2365,9 +2881,9 @@
       </w:tblBorders>
     </w:tblPr>
   </w:style>
-  <w:style w:type="table" w:styleId="LightShading">
+  <w:style w:type="table" w:styleId="Sombreadoclaro">
     <w:name w:val="Light Shading"/>
-    <w:basedOn w:val="TableNormal"/>
+    <w:basedOn w:val="Tablanormal"/>
     <w:uiPriority w:val="60"/>
     <w:rsid w:val="00FC693F"/>
     <w:pPr>
@@ -2461,9 +2977,9 @@
       </w:tcPr>
     </w:tblStylePr>
   </w:style>
-  <w:style w:type="table" w:styleId="LightShading-Accent1">
+  <w:style w:type="table" w:styleId="Sombreadoclaro-nfasis1">
     <w:name w:val="Light Shading Accent 1"/>
-    <w:basedOn w:val="TableNormal"/>
+    <w:basedOn w:val="Tablanormal"/>
     <w:uiPriority w:val="60"/>
     <w:rsid w:val="00FC693F"/>
     <w:pPr>
@@ -2557,9 +3073,9 @@
       </w:tcPr>
     </w:tblStylePr>
   </w:style>
-  <w:style w:type="table" w:styleId="LightShading-Accent2">
+  <w:style w:type="table" w:styleId="Sombreadoclaro-nfasis2">
     <w:name w:val="Light Shading Accent 2"/>
-    <w:basedOn w:val="TableNormal"/>
+    <w:basedOn w:val="Tablanormal"/>
     <w:uiPriority w:val="60"/>
     <w:rsid w:val="00FC693F"/>
     <w:pPr>
@@ -2653,9 +3169,9 @@
       </w:tcPr>
     </w:tblStylePr>
   </w:style>
-  <w:style w:type="table" w:styleId="LightShading-Accent3">
+  <w:style w:type="table" w:styleId="Sombreadoclaro-nfasis3">
     <w:name w:val="Light Shading Accent 3"/>
-    <w:basedOn w:val="TableNormal"/>
+    <w:basedOn w:val="Tablanormal"/>
     <w:uiPriority w:val="60"/>
     <w:rsid w:val="00FC693F"/>
     <w:pPr>
@@ -2749,9 +3265,9 @@
       </w:tcPr>
     </w:tblStylePr>
   </w:style>
-  <w:style w:type="table" w:styleId="LightShading-Accent4">
+  <w:style w:type="table" w:styleId="Sombreadoclaro-nfasis4">
     <w:name w:val="Light Shading Accent 4"/>
-    <w:basedOn w:val="TableNormal"/>
+    <w:basedOn w:val="Tablanormal"/>
     <w:uiPriority w:val="60"/>
     <w:rsid w:val="00FC693F"/>
     <w:pPr>
@@ -2845,9 +3361,9 @@
       </w:tcPr>
     </w:tblStylePr>
   </w:style>
-  <w:style w:type="table" w:styleId="LightShading-Accent5">
+  <w:style w:type="table" w:styleId="Sombreadoclaro-nfasis5">
     <w:name w:val="Light Shading Accent 5"/>
-    <w:basedOn w:val="TableNormal"/>
+    <w:basedOn w:val="Tablanormal"/>
     <w:uiPriority w:val="60"/>
     <w:rsid w:val="00FC693F"/>
     <w:pPr>
@@ -2941,9 +3457,9 @@
       </w:tcPr>
     </w:tblStylePr>
   </w:style>
-  <w:style w:type="table" w:styleId="LightShading-Accent6">
+  <w:style w:type="table" w:styleId="Sombreadoclaro-nfasis6">
     <w:name w:val="Light Shading Accent 6"/>
-    <w:basedOn w:val="TableNormal"/>
+    <w:basedOn w:val="Tablanormal"/>
     <w:uiPriority w:val="60"/>
     <w:rsid w:val="00FC693F"/>
     <w:pPr>
@@ -3037,9 +3553,9 @@
       </w:tcPr>
     </w:tblStylePr>
   </w:style>
-  <w:style w:type="table" w:styleId="LightList">
+  <w:style w:type="table" w:styleId="Listaclara">
     <w:name w:val="Light List"/>
-    <w:basedOn w:val="TableNormal"/>
+    <w:basedOn w:val="Tablanormal"/>
     <w:uiPriority w:val="61"/>
     <w:rsid w:val="00FC693F"/>
     <w:pPr>
@@ -3122,9 +3638,9 @@
       </w:tcPr>
     </w:tblStylePr>
   </w:style>
-  <w:style w:type="table" w:styleId="LightList-Accent1">
+  <w:style w:type="table" w:styleId="Listaclara-nfasis1">
     <w:name w:val="Light List Accent 1"/>
-    <w:basedOn w:val="TableNormal"/>
+    <w:basedOn w:val="Tablanormal"/>
     <w:uiPriority w:val="61"/>
     <w:rsid w:val="00FC693F"/>
     <w:pPr>
@@ -3207,9 +3723,9 @@
       </w:tcPr>
     </w:tblStylePr>
   </w:style>
-  <w:style w:type="table" w:styleId="LightList-Accent2">
+  <w:style w:type="table" w:styleId="Listaclara-nfasis2">
     <w:name w:val="Light List Accent 2"/>
-    <w:basedOn w:val="TableNormal"/>
+    <w:basedOn w:val="Tablanormal"/>
     <w:uiPriority w:val="61"/>
     <w:rsid w:val="00CB0664"/>
     <w:pPr>
@@ -3292,9 +3808,9 @@
       </w:tcPr>
     </w:tblStylePr>
   </w:style>
-  <w:style w:type="table" w:styleId="LightList-Accent3">
+  <w:style w:type="table" w:styleId="Listaclara-nfasis3">
     <w:name w:val="Light List Accent 3"/>
-    <w:basedOn w:val="TableNormal"/>
+    <w:basedOn w:val="Tablanormal"/>
     <w:uiPriority w:val="61"/>
     <w:rsid w:val="00CB0664"/>
     <w:pPr>
@@ -3377,9 +3893,9 @@
       </w:tcPr>
     </w:tblStylePr>
   </w:style>
-  <w:style w:type="table" w:styleId="LightList-Accent4">
+  <w:style w:type="table" w:styleId="Listaclara-nfasis4">
     <w:name w:val="Light List Accent 4"/>
-    <w:basedOn w:val="TableNormal"/>
+    <w:basedOn w:val="Tablanormal"/>
     <w:uiPriority w:val="61"/>
     <w:rsid w:val="00CB0664"/>
     <w:pPr>
@@ -3462,9 +3978,9 @@
       </w:tcPr>
     </w:tblStylePr>
   </w:style>
-  <w:style w:type="table" w:styleId="LightList-Accent5">
+  <w:style w:type="table" w:styleId="Listaclara-nfasis5">
     <w:name w:val="Light List Accent 5"/>
-    <w:basedOn w:val="TableNormal"/>
+    <w:basedOn w:val="Tablanormal"/>
     <w:uiPriority w:val="61"/>
     <w:rsid w:val="00CB0664"/>
     <w:pPr>
@@ -3547,9 +4063,9 @@
       </w:tcPr>
     </w:tblStylePr>
   </w:style>
-  <w:style w:type="table" w:styleId="LightList-Accent6">
+  <w:style w:type="table" w:styleId="Listaclara-nfasis6">
     <w:name w:val="Light List Accent 6"/>
-    <w:basedOn w:val="TableNormal"/>
+    <w:basedOn w:val="Tablanormal"/>
     <w:uiPriority w:val="61"/>
     <w:rsid w:val="00CB0664"/>
     <w:pPr>
@@ -3632,9 +4148,9 @@
       </w:tcPr>
     </w:tblStylePr>
   </w:style>
-  <w:style w:type="table" w:styleId="LightGrid">
+  <w:style w:type="table" w:styleId="Cuadrculaclara">
     <w:name w:val="Light Grid"/>
-    <w:basedOn w:val="TableNormal"/>
+    <w:basedOn w:val="Tablanormal"/>
     <w:uiPriority w:val="62"/>
     <w:rsid w:val="00CB0664"/>
     <w:pPr>
@@ -3755,9 +4271,9 @@
       </w:tcPr>
     </w:tblStylePr>
   </w:style>
-  <w:style w:type="table" w:styleId="LightGrid-Accent1">
+  <w:style w:type="table" w:styleId="Cuadrculaclara-nfasis1">
     <w:name w:val="Light Grid Accent 1"/>
-    <w:basedOn w:val="TableNormal"/>
+    <w:basedOn w:val="Tablanormal"/>
     <w:uiPriority w:val="62"/>
     <w:rsid w:val="00CB0664"/>
     <w:pPr>
@@ -3878,9 +4394,9 @@
       </w:tcPr>
     </w:tblStylePr>
   </w:style>
-  <w:style w:type="table" w:styleId="LightGrid-Accent2">
+  <w:style w:type="table" w:styleId="Cuadrculaclara-nfasis2">
     <w:name w:val="Light Grid Accent 2"/>
-    <w:basedOn w:val="TableNormal"/>
+    <w:basedOn w:val="Tablanormal"/>
     <w:uiPriority w:val="62"/>
     <w:rsid w:val="00CB0664"/>
     <w:pPr>
@@ -4001,9 +4517,9 @@
       </w:tcPr>
     </w:tblStylePr>
   </w:style>
-  <w:style w:type="table" w:styleId="LightGrid-Accent3">
+  <w:style w:type="table" w:styleId="Cuadrculaclara-nfasis3">
     <w:name w:val="Light Grid Accent 3"/>
-    <w:basedOn w:val="TableNormal"/>
+    <w:basedOn w:val="Tablanormal"/>
     <w:uiPriority w:val="62"/>
     <w:rsid w:val="00CB0664"/>
     <w:pPr>
@@ -4124,9 +4640,9 @@
       </w:tcPr>
     </w:tblStylePr>
   </w:style>
-  <w:style w:type="table" w:styleId="LightGrid-Accent4">
+  <w:style w:type="table" w:styleId="Cuadrculaclara-nfasis4">
     <w:name w:val="Light Grid Accent 4"/>
-    <w:basedOn w:val="TableNormal"/>
+    <w:basedOn w:val="Tablanormal"/>
     <w:uiPriority w:val="62"/>
     <w:rsid w:val="00CB0664"/>
     <w:pPr>
@@ -4247,9 +4763,9 @@
       </w:tcPr>
     </w:tblStylePr>
   </w:style>
-  <w:style w:type="table" w:styleId="LightGrid-Accent5">
+  <w:style w:type="table" w:styleId="Cuadrculaclara-nfasis5">
     <w:name w:val="Light Grid Accent 5"/>
-    <w:basedOn w:val="TableNormal"/>
+    <w:basedOn w:val="Tablanormal"/>
     <w:uiPriority w:val="62"/>
     <w:rsid w:val="00CB0664"/>
     <w:pPr>
@@ -4370,9 +4886,9 @@
       </w:tcPr>
     </w:tblStylePr>
   </w:style>
-  <w:style w:type="table" w:styleId="LightGrid-Accent6">
+  <w:style w:type="table" w:styleId="Cuadrculaclara-nfasis6">
     <w:name w:val="Light Grid Accent 6"/>
-    <w:basedOn w:val="TableNormal"/>
+    <w:basedOn w:val="Tablanormal"/>
     <w:uiPriority w:val="62"/>
     <w:rsid w:val="00CB0664"/>
     <w:pPr>
@@ -4493,9 +5009,9 @@
       </w:tcPr>
     </w:tblStylePr>
   </w:style>
-  <w:style w:type="table" w:styleId="MediumShading1">
+  <w:style w:type="table" w:styleId="Sombreadomedio1">
     <w:name w:val="Medium Shading 1"/>
-    <w:basedOn w:val="TableNormal"/>
+    <w:basedOn w:val="Tablanormal"/>
     <w:uiPriority w:val="63"/>
     <w:rsid w:val="00CB0664"/>
     <w:pPr>
@@ -4592,9 +5108,9 @@
       </w:tcPr>
     </w:tblStylePr>
   </w:style>
-  <w:style w:type="table" w:styleId="MediumShading1-Accent1">
+  <w:style w:type="table" w:styleId="Sombreadomedio1-nfasis1">
     <w:name w:val="Medium Shading 1 Accent 1"/>
-    <w:basedOn w:val="TableNormal"/>
+    <w:basedOn w:val="Tablanormal"/>
     <w:uiPriority w:val="63"/>
     <w:rsid w:val="00CB0664"/>
     <w:pPr>
@@ -4691,9 +5207,9 @@
       </w:tcPr>
     </w:tblStylePr>
   </w:style>
-  <w:style w:type="table" w:styleId="MediumShading1-Accent2">
+  <w:style w:type="table" w:styleId="Sombreadomedio1-nfasis2">
     <w:name w:val="Medium Shading 1 Accent 2"/>
-    <w:basedOn w:val="TableNormal"/>
+    <w:basedOn w:val="Tablanormal"/>
     <w:uiPriority w:val="63"/>
     <w:rsid w:val="00CB0664"/>
     <w:pPr>
@@ -4790,9 +5306,9 @@
       </w:tcPr>
     </w:tblStylePr>
   </w:style>
-  <w:style w:type="table" w:styleId="MediumShading1-Accent3">
+  <w:style w:type="table" w:styleId="Sombreadomedio1-nfasis3">
     <w:name w:val="Medium Shading 1 Accent 3"/>
-    <w:basedOn w:val="TableNormal"/>
+    <w:basedOn w:val="Tablanormal"/>
     <w:uiPriority w:val="63"/>
     <w:rsid w:val="00CB0664"/>
     <w:pPr>
@@ -4889,9 +5405,9 @@
       </w:tcPr>
     </w:tblStylePr>
   </w:style>
-  <w:style w:type="table" w:styleId="MediumShading1-Accent4">
+  <w:style w:type="table" w:styleId="Sombreadomedio1-nfasis4">
     <w:name w:val="Medium Shading 1 Accent 4"/>
-    <w:basedOn w:val="TableNormal"/>
+    <w:basedOn w:val="Tablanormal"/>
     <w:uiPriority w:val="63"/>
     <w:rsid w:val="00CB0664"/>
     <w:pPr>
@@ -4988,9 +5504,9 @@
       </w:tcPr>
     </w:tblStylePr>
   </w:style>
-  <w:style w:type="table" w:styleId="MediumShading1-Accent5">
+  <w:style w:type="table" w:styleId="Sombreadomedio1-nfasis5">
     <w:name w:val="Medium Shading 1 Accent 5"/>
-    <w:basedOn w:val="TableNormal"/>
+    <w:basedOn w:val="Tablanormal"/>
     <w:uiPriority w:val="63"/>
     <w:rsid w:val="00CB0664"/>
     <w:pPr>
@@ -5087,9 +5603,9 @@
       </w:tcPr>
     </w:tblStylePr>
   </w:style>
-  <w:style w:type="table" w:styleId="MediumShading1-Accent6">
+  <w:style w:type="table" w:styleId="Sombreadomedio1-nfasis6">
     <w:name w:val="Medium Shading 1 Accent 6"/>
-    <w:basedOn w:val="TableNormal"/>
+    <w:basedOn w:val="Tablanormal"/>
     <w:uiPriority w:val="63"/>
     <w:rsid w:val="00CB0664"/>
     <w:pPr>
@@ -5186,9 +5702,9 @@
       </w:tcPr>
     </w:tblStylePr>
   </w:style>
-  <w:style w:type="table" w:styleId="MediumShading2">
+  <w:style w:type="table" w:styleId="Sombreadomedio2">
     <w:name w:val="Medium Shading 2"/>
-    <w:basedOn w:val="TableNormal"/>
+    <w:basedOn w:val="Tablanormal"/>
     <w:uiPriority w:val="64"/>
     <w:rsid w:val="00CB0664"/>
     <w:pPr>
@@ -5328,9 +5844,9 @@
       </w:tcPr>
     </w:tblStylePr>
   </w:style>
-  <w:style w:type="table" w:styleId="MediumShading2-Accent1">
+  <w:style w:type="table" w:styleId="Sombreadomedio2-nfasis1">
     <w:name w:val="Medium Shading 2 Accent 1"/>
-    <w:basedOn w:val="TableNormal"/>
+    <w:basedOn w:val="Tablanormal"/>
     <w:uiPriority w:val="64"/>
     <w:rsid w:val="00CB0664"/>
     <w:pPr>
@@ -5470,9 +5986,9 @@
       </w:tcPr>
     </w:tblStylePr>
   </w:style>
-  <w:style w:type="table" w:styleId="MediumShading2-Accent2">
+  <w:style w:type="table" w:styleId="Sombreadomedio2-nfasis2">
     <w:name w:val="Medium Shading 2 Accent 2"/>
-    <w:basedOn w:val="TableNormal"/>
+    <w:basedOn w:val="Tablanormal"/>
     <w:uiPriority w:val="64"/>
     <w:rsid w:val="00CB0664"/>
     <w:pPr>
@@ -5612,9 +6128,9 @@
       </w:tcPr>
     </w:tblStylePr>
   </w:style>
-  <w:style w:type="table" w:styleId="MediumShading2-Accent3">
+  <w:style w:type="table" w:styleId="Sombreadomedio2-nfasis3">
     <w:name w:val="Medium Shading 2 Accent 3"/>
-    <w:basedOn w:val="TableNormal"/>
+    <w:basedOn w:val="Tablanormal"/>
     <w:uiPriority w:val="64"/>
     <w:rsid w:val="00CB0664"/>
     <w:pPr>
@@ -5754,9 +6270,9 @@
       </w:tcPr>
     </w:tblStylePr>
   </w:style>
-  <w:style w:type="table" w:styleId="MediumShading2-Accent4">
+  <w:style w:type="table" w:styleId="Sombreadomedio2-nfasis4">
     <w:name w:val="Medium Shading 2 Accent 4"/>
-    <w:basedOn w:val="TableNormal"/>
+    <w:basedOn w:val="Tablanormal"/>
     <w:uiPriority w:val="64"/>
     <w:rsid w:val="00CB0664"/>
     <w:pPr>
@@ -5896,9 +6412,9 @@
       </w:tcPr>
     </w:tblStylePr>
   </w:style>
-  <w:style w:type="table" w:styleId="MediumShading2-Accent5">
+  <w:style w:type="table" w:styleId="Sombreadomedio2-nfasis5">
     <w:name w:val="Medium Shading 2 Accent 5"/>
-    <w:basedOn w:val="TableNormal"/>
+    <w:basedOn w:val="Tablanormal"/>
     <w:uiPriority w:val="64"/>
     <w:rsid w:val="00CB0664"/>
     <w:pPr>
@@ -6038,9 +6554,9 @@
       </w:tcPr>
     </w:tblStylePr>
   </w:style>
-  <w:style w:type="table" w:styleId="MediumShading2-Accent6">
+  <w:style w:type="table" w:styleId="Sombreadomedio2-nfasis6">
     <w:name w:val="Medium Shading 2 Accent 6"/>
-    <w:basedOn w:val="TableNormal"/>
+    <w:basedOn w:val="Tablanormal"/>
     <w:uiPriority w:val="64"/>
     <w:rsid w:val="00CB0664"/>
     <w:pPr>
@@ -6180,9 +6696,9 @@
       </w:tcPr>
     </w:tblStylePr>
   </w:style>
-  <w:style w:type="table" w:styleId="MediumList1">
+  <w:style w:type="table" w:styleId="Listamedia1">
     <w:name w:val="Medium List 1"/>
-    <w:basedOn w:val="TableNormal"/>
+    <w:basedOn w:val="Tablanormal"/>
     <w:uiPriority w:val="65"/>
     <w:rsid w:val="00CB0664"/>
     <w:pPr>
@@ -6257,9 +6773,9 @@
       </w:tcPr>
     </w:tblStylePr>
   </w:style>
-  <w:style w:type="table" w:styleId="MediumList1-Accent1">
+  <w:style w:type="table" w:styleId="Listamedia1-nfasis1">
     <w:name w:val="Medium List 1 Accent 1"/>
-    <w:basedOn w:val="TableNormal"/>
+    <w:basedOn w:val="Tablanormal"/>
     <w:uiPriority w:val="65"/>
     <w:rsid w:val="00CB0664"/>
     <w:pPr>
@@ -6334,9 +6850,9 @@
       </w:tcPr>
     </w:tblStylePr>
   </w:style>
-  <w:style w:type="table" w:styleId="MediumList1-Accent2">
+  <w:style w:type="table" w:styleId="Listamedia1-nfasis2">
     <w:name w:val="Medium List 1 Accent 2"/>
-    <w:basedOn w:val="TableNormal"/>
+    <w:basedOn w:val="Tablanormal"/>
     <w:uiPriority w:val="65"/>
     <w:rsid w:val="00CB0664"/>
     <w:pPr>
@@ -6411,9 +6927,9 @@
       </w:tcPr>
     </w:tblStylePr>
   </w:style>
-  <w:style w:type="table" w:styleId="MediumList1-Accent3">
+  <w:style w:type="table" w:styleId="Listamedia1-nfasis3">
     <w:name w:val="Medium List 1 Accent 3"/>
-    <w:basedOn w:val="TableNormal"/>
+    <w:basedOn w:val="Tablanormal"/>
     <w:uiPriority w:val="65"/>
     <w:rsid w:val="00CB0664"/>
     <w:pPr>
@@ -6488,9 +7004,9 @@
       </w:tcPr>
     </w:tblStylePr>
   </w:style>
-  <w:style w:type="table" w:styleId="MediumList1-Accent4">
+  <w:style w:type="table" w:styleId="Listamedia1-nfasis4">
     <w:name w:val="Medium List 1 Accent 4"/>
-    <w:basedOn w:val="TableNormal"/>
+    <w:basedOn w:val="Tablanormal"/>
     <w:uiPriority w:val="65"/>
     <w:rsid w:val="00CB0664"/>
     <w:pPr>
@@ -6565,9 +7081,9 @@
       </w:tcPr>
     </w:tblStylePr>
   </w:style>
-  <w:style w:type="table" w:styleId="MediumList1-Accent5">
+  <w:style w:type="table" w:styleId="Listamedia1-nfasis5">
     <w:name w:val="Medium List 1 Accent 5"/>
-    <w:basedOn w:val="TableNormal"/>
+    <w:basedOn w:val="Tablanormal"/>
     <w:uiPriority w:val="65"/>
     <w:rsid w:val="00CB0664"/>
     <w:pPr>
@@ -6642,9 +7158,9 @@
       </w:tcPr>
     </w:tblStylePr>
   </w:style>
-  <w:style w:type="table" w:styleId="MediumList1-Accent6">
+  <w:style w:type="table" w:styleId="Listamedia1-nfasis6">
     <w:name w:val="Medium List 1 Accent 6"/>
-    <w:basedOn w:val="TableNormal"/>
+    <w:basedOn w:val="Tablanormal"/>
     <w:uiPriority w:val="65"/>
     <w:rsid w:val="00CB0664"/>
     <w:pPr>
@@ -6719,9 +7235,9 @@
       </w:tcPr>
     </w:tblStylePr>
   </w:style>
-  <w:style w:type="table" w:styleId="MediumList2">
+  <w:style w:type="table" w:styleId="Listamedia2">
     <w:name w:val="Medium List 2"/>
-    <w:basedOn w:val="TableNormal"/>
+    <w:basedOn w:val="Tablanormal"/>
     <w:uiPriority w:val="66"/>
     <w:rsid w:val="00CB0664"/>
     <w:pPr>
@@ -6840,9 +7356,9 @@
       </w:tcPr>
     </w:tblStylePr>
   </w:style>
-  <w:style w:type="table" w:styleId="MediumList2-Accent1">
+  <w:style w:type="table" w:styleId="Listamedia2-nfasis1">
     <w:name w:val="Medium List 2 Accent 1"/>
-    <w:basedOn w:val="TableNormal"/>
+    <w:basedOn w:val="Tablanormal"/>
     <w:uiPriority w:val="66"/>
     <w:rsid w:val="00CB0664"/>
     <w:pPr>
@@ -6961,9 +7477,9 @@
       </w:tcPr>
     </w:tblStylePr>
   </w:style>
-  <w:style w:type="table" w:styleId="MediumList2-Accent2">
+  <w:style w:type="table" w:styleId="Listamedia2-nfasis2">
     <w:name w:val="Medium List 2 Accent 2"/>
-    <w:basedOn w:val="TableNormal"/>
+    <w:basedOn w:val="Tablanormal"/>
     <w:uiPriority w:val="66"/>
     <w:rsid w:val="00CB0664"/>
     <w:pPr>
@@ -7082,9 +7598,9 @@
       </w:tcPr>
     </w:tblStylePr>
   </w:style>
-  <w:style w:type="table" w:styleId="MediumList2-Accent3">
+  <w:style w:type="table" w:styleId="Listamedia2-nfasis3">
     <w:name w:val="Medium List 2 Accent 3"/>
-    <w:basedOn w:val="TableNormal"/>
+    <w:basedOn w:val="Tablanormal"/>
     <w:uiPriority w:val="66"/>
     <w:rsid w:val="00CB0664"/>
     <w:pPr>
@@ -7203,9 +7719,9 @@
       </w:tcPr>
     </w:tblStylePr>
   </w:style>
-  <w:style w:type="table" w:styleId="MediumList2-Accent4">
+  <w:style w:type="table" w:styleId="Listamedia2-nfasis4">
     <w:name w:val="Medium List 2 Accent 4"/>
-    <w:basedOn w:val="TableNormal"/>
+    <w:basedOn w:val="Tablanormal"/>
     <w:uiPriority w:val="66"/>
     <w:rsid w:val="00CB0664"/>
     <w:pPr>
@@ -7324,9 +7840,9 @@
       </w:tcPr>
     </w:tblStylePr>
   </w:style>
-  <w:style w:type="table" w:styleId="MediumList2-Accent5">
+  <w:style w:type="table" w:styleId="Listamedia2-nfasis5">
     <w:name w:val="Medium List 2 Accent 5"/>
-    <w:basedOn w:val="TableNormal"/>
+    <w:basedOn w:val="Tablanormal"/>
     <w:uiPriority w:val="66"/>
     <w:rsid w:val="00CB0664"/>
     <w:pPr>
@@ -7445,9 +7961,9 @@
       </w:tcPr>
     </w:tblStylePr>
   </w:style>
-  <w:style w:type="table" w:styleId="MediumList2-Accent6">
+  <w:style w:type="table" w:styleId="Listamedia2-nfasis6">
     <w:name w:val="Medium List 2 Accent 6"/>
-    <w:basedOn w:val="TableNormal"/>
+    <w:basedOn w:val="Tablanormal"/>
     <w:uiPriority w:val="66"/>
     <w:rsid w:val="00CB0664"/>
     <w:pPr>
@@ -7566,9 +8082,9 @@
       </w:tcPr>
     </w:tblStylePr>
   </w:style>
-  <w:style w:type="table" w:styleId="MediumGrid1">
+  <w:style w:type="table" w:styleId="Cuadrculamedia1">
     <w:name w:val="Medium Grid 1"/>
-    <w:basedOn w:val="TableNormal"/>
+    <w:basedOn w:val="Tablanormal"/>
     <w:uiPriority w:val="67"/>
     <w:rsid w:val="00CB0664"/>
     <w:pPr>
@@ -7632,9 +8148,9 @@
       </w:tcPr>
     </w:tblStylePr>
   </w:style>
-  <w:style w:type="table" w:styleId="MediumGrid1-Accent1">
+  <w:style w:type="table" w:styleId="Cuadrculamedia1-nfasis1">
     <w:name w:val="Medium Grid 1 Accent 1"/>
-    <w:basedOn w:val="TableNormal"/>
+    <w:basedOn w:val="Tablanormal"/>
     <w:uiPriority w:val="67"/>
     <w:rsid w:val="00CB0664"/>
     <w:pPr>
@@ -7698,9 +8214,9 @@
       </w:tcPr>
     </w:tblStylePr>
   </w:style>
-  <w:style w:type="table" w:styleId="MediumGrid1-Accent2">
+  <w:style w:type="table" w:styleId="Cuadrculamedia1-nfasis2">
     <w:name w:val="Medium Grid 1 Accent 2"/>
-    <w:basedOn w:val="TableNormal"/>
+    <w:basedOn w:val="Tablanormal"/>
     <w:uiPriority w:val="67"/>
     <w:rsid w:val="00CB0664"/>
     <w:pPr>
@@ -7764,9 +8280,9 @@
       </w:tcPr>
     </w:tblStylePr>
   </w:style>
-  <w:style w:type="table" w:styleId="MediumGrid1-Accent3">
+  <w:style w:type="table" w:styleId="Cuadrculamedia1-nfasis3">
     <w:name w:val="Medium Grid 1 Accent 3"/>
-    <w:basedOn w:val="TableNormal"/>
+    <w:basedOn w:val="Tablanormal"/>
     <w:uiPriority w:val="67"/>
     <w:rsid w:val="00CB0664"/>
     <w:pPr>
@@ -7830,9 +8346,9 @@
       </w:tcPr>
     </w:tblStylePr>
   </w:style>
-  <w:style w:type="table" w:styleId="MediumGrid1-Accent4">
+  <w:style w:type="table" w:styleId="Cuadrculamedia1-nfasis4">
     <w:name w:val="Medium Grid 1 Accent 4"/>
-    <w:basedOn w:val="TableNormal"/>
+    <w:basedOn w:val="Tablanormal"/>
     <w:uiPriority w:val="67"/>
     <w:rsid w:val="00CB0664"/>
     <w:pPr>
@@ -7896,9 +8412,9 @@
       </w:tcPr>
     </w:tblStylePr>
   </w:style>
-  <w:style w:type="table" w:styleId="MediumGrid1-Accent5">
+  <w:style w:type="table" w:styleId="Cuadrculamedia1-nfasis5">
     <w:name w:val="Medium Grid 1 Accent 5"/>
-    <w:basedOn w:val="TableNormal"/>
+    <w:basedOn w:val="Tablanormal"/>
     <w:uiPriority w:val="67"/>
     <w:rsid w:val="00CB0664"/>
     <w:pPr>
@@ -7962,9 +8478,9 @@
       </w:tcPr>
     </w:tblStylePr>
   </w:style>
-  <w:style w:type="table" w:styleId="MediumGrid1-Accent6">
+  <w:style w:type="table" w:styleId="Cuadrculamedia1-nfasis6">
     <w:name w:val="Medium Grid 1 Accent 6"/>
-    <w:basedOn w:val="TableNormal"/>
+    <w:basedOn w:val="Tablanormal"/>
     <w:uiPriority w:val="67"/>
     <w:rsid w:val="00CB0664"/>
     <w:pPr>
@@ -8028,9 +8544,9 @@
       </w:tcPr>
     </w:tblStylePr>
   </w:style>
-  <w:style w:type="table" w:styleId="MediumGrid2">
+  <w:style w:type="table" w:styleId="Cuadrculamedia2">
     <w:name w:val="Medium Grid 2"/>
-    <w:basedOn w:val="TableNormal"/>
+    <w:basedOn w:val="Tablanormal"/>
     <w:uiPriority w:val="68"/>
     <w:rsid w:val="00CB0664"/>
     <w:pPr>
@@ -8146,9 +8662,9 @@
       </w:tcPr>
     </w:tblStylePr>
   </w:style>
-  <w:style w:type="table" w:styleId="MediumGrid2-Accent1">
+  <w:style w:type="table" w:styleId="Cuadrculamedia2-nfasis1">
     <w:name w:val="Medium Grid 2 Accent 1"/>
-    <w:basedOn w:val="TableNormal"/>
+    <w:basedOn w:val="Tablanormal"/>
     <w:uiPriority w:val="68"/>
     <w:rsid w:val="00CB0664"/>
     <w:pPr>
@@ -8264,9 +8780,9 @@
       </w:tcPr>
     </w:tblStylePr>
   </w:style>
-  <w:style w:type="table" w:styleId="MediumGrid2-Accent2">
+  <w:style w:type="table" w:styleId="Cuadrculamedia2-nfasis2">
     <w:name w:val="Medium Grid 2 Accent 2"/>
-    <w:basedOn w:val="TableNormal"/>
+    <w:basedOn w:val="Tablanormal"/>
     <w:uiPriority w:val="68"/>
     <w:rsid w:val="00CB0664"/>
     <w:pPr>
@@ -8382,9 +8898,9 @@
       </w:tcPr>
     </w:tblStylePr>
   </w:style>
-  <w:style w:type="table" w:styleId="MediumGrid2-Accent3">
+  <w:style w:type="table" w:styleId="Cuadrculamedia2-nfasis3">
     <w:name w:val="Medium Grid 2 Accent 3"/>
-    <w:basedOn w:val="TableNormal"/>
+    <w:basedOn w:val="Tablanormal"/>
     <w:uiPriority w:val="68"/>
     <w:rsid w:val="00CB0664"/>
     <w:pPr>
@@ -8500,9 +9016,9 @@
       </w:tcPr>
     </w:tblStylePr>
   </w:style>
-  <w:style w:type="table" w:styleId="MediumGrid2-Accent4">
+  <w:style w:type="table" w:styleId="Cuadrculamedia2-nfasis4">
     <w:name w:val="Medium Grid 2 Accent 4"/>
-    <w:basedOn w:val="TableNormal"/>
+    <w:basedOn w:val="Tablanormal"/>
     <w:uiPriority w:val="68"/>
     <w:rsid w:val="00CB0664"/>
     <w:pPr>
@@ -8618,9 +9134,9 @@
       </w:tcPr>
     </w:tblStylePr>
   </w:style>
-  <w:style w:type="table" w:styleId="MediumGrid2-Accent5">
+  <w:style w:type="table" w:styleId="Cuadrculamedia2-nfasis5">
     <w:name w:val="Medium Grid 2 Accent 5"/>
-    <w:basedOn w:val="TableNormal"/>
+    <w:basedOn w:val="Tablanormal"/>
     <w:uiPriority w:val="68"/>
     <w:rsid w:val="00CB0664"/>
     <w:pPr>
@@ -8736,9 +9252,9 @@
       </w:tcPr>
     </w:tblStylePr>
   </w:style>
-  <w:style w:type="table" w:styleId="MediumGrid2-Accent6">
+  <w:style w:type="table" w:styleId="Cuadrculamedia2-nfasis6">
     <w:name w:val="Medium Grid 2 Accent 6"/>
-    <w:basedOn w:val="TableNormal"/>
+    <w:basedOn w:val="Tablanormal"/>
     <w:uiPriority w:val="68"/>
     <w:rsid w:val="00CB0664"/>
     <w:pPr>
@@ -8854,9 +9370,9 @@
       </w:tcPr>
     </w:tblStylePr>
   </w:style>
-  <w:style w:type="table" w:styleId="MediumGrid3">
+  <w:style w:type="table" w:styleId="Cuadrculamedia3">
     <w:name w:val="Medium Grid 3"/>
-    <w:basedOn w:val="TableNormal"/>
+    <w:basedOn w:val="Tablanormal"/>
     <w:uiPriority w:val="69"/>
     <w:rsid w:val="00CB0664"/>
     <w:pPr>
@@ -8988,9 +9504,9 @@
       </w:tcPr>
     </w:tblStylePr>
   </w:style>
-  <w:style w:type="table" w:styleId="MediumGrid3-Accent1">
+  <w:style w:type="table" w:styleId="Cuadrculamedia3-nfasis1">
     <w:name w:val="Medium Grid 3 Accent 1"/>
-    <w:basedOn w:val="TableNormal"/>
+    <w:basedOn w:val="Tablanormal"/>
     <w:uiPriority w:val="69"/>
     <w:rsid w:val="00CB0664"/>
     <w:pPr>
@@ -9122,9 +9638,9 @@
       </w:tcPr>
     </w:tblStylePr>
   </w:style>
-  <w:style w:type="table" w:styleId="MediumGrid3-Accent2">
+  <w:style w:type="table" w:styleId="Cuadrculamedia3-nfasis2">
     <w:name w:val="Medium Grid 3 Accent 2"/>
-    <w:basedOn w:val="TableNormal"/>
+    <w:basedOn w:val="Tablanormal"/>
     <w:uiPriority w:val="69"/>
     <w:rsid w:val="00CB0664"/>
     <w:pPr>
@@ -9256,9 +9772,9 @@
       </w:tcPr>
     </w:tblStylePr>
   </w:style>
-  <w:style w:type="table" w:styleId="MediumGrid3-Accent3">
+  <w:style w:type="table" w:styleId="Cuadrculamedia3-nfasis3">
     <w:name w:val="Medium Grid 3 Accent 3"/>
-    <w:basedOn w:val="TableNormal"/>
+    <w:basedOn w:val="Tablanormal"/>
     <w:uiPriority w:val="69"/>
     <w:rsid w:val="00CB0664"/>
     <w:pPr>
@@ -9390,9 +9906,9 @@
       </w:tcPr>
     </w:tblStylePr>
   </w:style>
-  <w:style w:type="table" w:styleId="MediumGrid3-Accent4">
+  <w:style w:type="table" w:styleId="Cuadrculamedia3-nfasis4">
     <w:name w:val="Medium Grid 3 Accent 4"/>
-    <w:basedOn w:val="TableNormal"/>
+    <w:basedOn w:val="Tablanormal"/>
     <w:uiPriority w:val="69"/>
     <w:rsid w:val="00CB0664"/>
     <w:pPr>
@@ -9524,9 +10040,9 @@
       </w:tcPr>
     </w:tblStylePr>
   </w:style>
-  <w:style w:type="table" w:styleId="MediumGrid3-Accent5">
+  <w:style w:type="table" w:styleId="Cuadrculamedia3-nfasis5">
     <w:name w:val="Medium Grid 3 Accent 5"/>
-    <w:basedOn w:val="TableNormal"/>
+    <w:basedOn w:val="Tablanormal"/>
     <w:uiPriority w:val="69"/>
     <w:rsid w:val="00CB0664"/>
     <w:pPr>
@@ -9658,9 +10174,9 @@
       </w:tcPr>
     </w:tblStylePr>
   </w:style>
-  <w:style w:type="table" w:styleId="MediumGrid3-Accent6">
+  <w:style w:type="table" w:styleId="Cuadrculamedia3-nfasis6">
     <w:name w:val="Medium Grid 3 Accent 6"/>
-    <w:basedOn w:val="TableNormal"/>
+    <w:basedOn w:val="Tablanormal"/>
     <w:uiPriority w:val="69"/>
     <w:rsid w:val="00CB0664"/>
     <w:pPr>
@@ -9792,9 +10308,9 @@
       </w:tcPr>
     </w:tblStylePr>
   </w:style>
-  <w:style w:type="table" w:styleId="DarkList">
+  <w:style w:type="table" w:styleId="Listaoscura">
     <w:name w:val="Dark List"/>
-    <w:basedOn w:val="TableNormal"/>
+    <w:basedOn w:val="Tablanormal"/>
     <w:uiPriority w:val="70"/>
     <w:rsid w:val="00CB0664"/>
     <w:pPr>
@@ -9899,9 +10415,9 @@
       </w:tcPr>
     </w:tblStylePr>
   </w:style>
-  <w:style w:type="table" w:styleId="DarkList-Accent1">
+  <w:style w:type="table" w:styleId="Listaoscura-nfasis1">
     <w:name w:val="Dark List Accent 1"/>
-    <w:basedOn w:val="TableNormal"/>
+    <w:basedOn w:val="Tablanormal"/>
     <w:uiPriority w:val="70"/>
     <w:rsid w:val="00CB0664"/>
     <w:pPr>
@@ -10006,9 +10522,9 @@
       </w:tcPr>
     </w:tblStylePr>
   </w:style>
-  <w:style w:type="table" w:styleId="DarkList-Accent2">
+  <w:style w:type="table" w:styleId="Listaoscura-nfasis2">
     <w:name w:val="Dark List Accent 2"/>
-    <w:basedOn w:val="TableNormal"/>
+    <w:basedOn w:val="Tablanormal"/>
     <w:uiPriority w:val="70"/>
     <w:rsid w:val="00CB0664"/>
     <w:pPr>
@@ -10113,9 +10629,9 @@
       </w:tcPr>
     </w:tblStylePr>
   </w:style>
-  <w:style w:type="table" w:styleId="DarkList-Accent3">
+  <w:style w:type="table" w:styleId="Listaoscura-nfasis3">
     <w:name w:val="Dark List Accent 3"/>
-    <w:basedOn w:val="TableNormal"/>
+    <w:basedOn w:val="Tablanormal"/>
     <w:uiPriority w:val="70"/>
     <w:rsid w:val="00CB0664"/>
     <w:pPr>
@@ -10220,9 +10736,9 @@
       </w:tcPr>
     </w:tblStylePr>
   </w:style>
-  <w:style w:type="table" w:styleId="DarkList-Accent4">
+  <w:style w:type="table" w:styleId="Listaoscura-nfasis4">
     <w:name w:val="Dark List Accent 4"/>
-    <w:basedOn w:val="TableNormal"/>
+    <w:basedOn w:val="Tablanormal"/>
     <w:uiPriority w:val="70"/>
     <w:rsid w:val="00CB0664"/>
     <w:pPr>
@@ -10327,9 +10843,9 @@
       </w:tcPr>
     </w:tblStylePr>
   </w:style>
-  <w:style w:type="table" w:styleId="DarkList-Accent5">
+  <w:style w:type="table" w:styleId="Listaoscura-nfasis5">
     <w:name w:val="Dark List Accent 5"/>
-    <w:basedOn w:val="TableNormal"/>
+    <w:basedOn w:val="Tablanormal"/>
     <w:uiPriority w:val="70"/>
     <w:rsid w:val="00CB0664"/>
     <w:pPr>
@@ -10434,9 +10950,9 @@
       </w:tcPr>
     </w:tblStylePr>
   </w:style>
-  <w:style w:type="table" w:styleId="DarkList-Accent6">
+  <w:style w:type="table" w:styleId="Listaoscura-nfasis6">
     <w:name w:val="Dark List Accent 6"/>
-    <w:basedOn w:val="TableNormal"/>
+    <w:basedOn w:val="Tablanormal"/>
     <w:uiPriority w:val="70"/>
     <w:rsid w:val="00CB0664"/>
     <w:pPr>
@@ -10541,9 +11057,9 @@
       </w:tcPr>
     </w:tblStylePr>
   </w:style>
-  <w:style w:type="table" w:styleId="ColorfulShading">
+  <w:style w:type="table" w:styleId="Sombreadovistoso">
     <w:name w:val="Colorful Shading"/>
-    <w:basedOn w:val="TableNormal"/>
+    <w:basedOn w:val="Tablanormal"/>
     <w:uiPriority w:val="71"/>
     <w:rsid w:val="00CB0664"/>
     <w:pPr>
@@ -10656,9 +11172,9 @@
       </w:rPr>
     </w:tblStylePr>
   </w:style>
-  <w:style w:type="table" w:styleId="ColorfulShading-Accent1">
+  <w:style w:type="table" w:styleId="Sombreadovistoso-nfasis1">
     <w:name w:val="Colorful Shading Accent 1"/>
-    <w:basedOn w:val="TableNormal"/>
+    <w:basedOn w:val="Tablanormal"/>
     <w:uiPriority w:val="71"/>
     <w:rsid w:val="00CB0664"/>
     <w:pPr>
@@ -10771,9 +11287,9 @@
       </w:rPr>
     </w:tblStylePr>
   </w:style>
-  <w:style w:type="table" w:styleId="ColorfulShading-Accent2">
+  <w:style w:type="table" w:styleId="Sombreadovistoso-nfasis2">
     <w:name w:val="Colorful Shading Accent 2"/>
-    <w:basedOn w:val="TableNormal"/>
+    <w:basedOn w:val="Tablanormal"/>
     <w:uiPriority w:val="71"/>
     <w:rsid w:val="00CB0664"/>
     <w:pPr>
@@ -10886,9 +11402,9 @@
       </w:rPr>
     </w:tblStylePr>
   </w:style>
-  <w:style w:type="table" w:styleId="ColorfulShading-Accent3">
+  <w:style w:type="table" w:styleId="Sombreadovistoso-nfasis3">
     <w:name w:val="Colorful Shading Accent 3"/>
-    <w:basedOn w:val="TableNormal"/>
+    <w:basedOn w:val="Tablanormal"/>
     <w:uiPriority w:val="71"/>
     <w:rsid w:val="00CB0664"/>
     <w:pPr>
@@ -10991,9 +11507,9 @@
       </w:tcPr>
     </w:tblStylePr>
   </w:style>
-  <w:style w:type="table" w:styleId="ColorfulShading-Accent4">
+  <w:style w:type="table" w:styleId="Sombreadovistoso-nfasis4">
     <w:name w:val="Colorful Shading Accent 4"/>
-    <w:basedOn w:val="TableNormal"/>
+    <w:basedOn w:val="Tablanormal"/>
     <w:uiPriority w:val="71"/>
     <w:rsid w:val="00CB0664"/>
     <w:pPr>
@@ -11106,9 +11622,9 @@
       </w:rPr>
     </w:tblStylePr>
   </w:style>
-  <w:style w:type="table" w:styleId="ColorfulShading-Accent5">
+  <w:style w:type="table" w:styleId="Sombreadovistoso-nfasis5">
     <w:name w:val="Colorful Shading Accent 5"/>
-    <w:basedOn w:val="TableNormal"/>
+    <w:basedOn w:val="Tablanormal"/>
     <w:uiPriority w:val="71"/>
     <w:rsid w:val="00CB0664"/>
     <w:pPr>
@@ -11221,9 +11737,9 @@
       </w:rPr>
     </w:tblStylePr>
   </w:style>
-  <w:style w:type="table" w:styleId="ColorfulShading-Accent6">
+  <w:style w:type="table" w:styleId="Sombreadovistoso-nfasis6">
     <w:name w:val="Colorful Shading Accent 6"/>
-    <w:basedOn w:val="TableNormal"/>
+    <w:basedOn w:val="Tablanormal"/>
     <w:uiPriority w:val="71"/>
     <w:rsid w:val="00CB0664"/>
     <w:pPr>
@@ -11336,9 +11852,9 @@
       </w:rPr>
     </w:tblStylePr>
   </w:style>
-  <w:style w:type="table" w:styleId="ColorfulList">
+  <w:style w:type="table" w:styleId="Listavistosa">
     <w:name w:val="Colorful List"/>
-    <w:basedOn w:val="TableNormal"/>
+    <w:basedOn w:val="Tablanormal"/>
     <w:uiPriority w:val="72"/>
     <w:rsid w:val="00CB0664"/>
     <w:pPr>
@@ -11415,9 +11931,9 @@
       </w:tcPr>
     </w:tblStylePr>
   </w:style>
-  <w:style w:type="table" w:styleId="ColorfulList-Accent1">
+  <w:style w:type="table" w:styleId="Listavistosa-nfasis1">
     <w:name w:val="Colorful List Accent 1"/>
-    <w:basedOn w:val="TableNormal"/>
+    <w:basedOn w:val="Tablanormal"/>
     <w:uiPriority w:val="72"/>
     <w:rsid w:val="00CB0664"/>
     <w:pPr>
@@ -11494,9 +12010,9 @@
       </w:tcPr>
     </w:tblStylePr>
   </w:style>
-  <w:style w:type="table" w:styleId="ColorfulList-Accent2">
+  <w:style w:type="table" w:styleId="Listavistosa-nfasis2">
     <w:name w:val="Colorful List Accent 2"/>
-    <w:basedOn w:val="TableNormal"/>
+    <w:basedOn w:val="Tablanormal"/>
     <w:uiPriority w:val="72"/>
     <w:rsid w:val="00CB0664"/>
     <w:pPr>
@@ -11573,9 +12089,9 @@
       </w:tcPr>
     </w:tblStylePr>
   </w:style>
-  <w:style w:type="table" w:styleId="ColorfulList-Accent3">
+  <w:style w:type="table" w:styleId="Listavistosa-nfasis3">
     <w:name w:val="Colorful List Accent 3"/>
-    <w:basedOn w:val="TableNormal"/>
+    <w:basedOn w:val="Tablanormal"/>
     <w:uiPriority w:val="72"/>
     <w:rsid w:val="00CB0664"/>
     <w:pPr>
@@ -11652,9 +12168,9 @@
       </w:tcPr>
     </w:tblStylePr>
   </w:style>
-  <w:style w:type="table" w:styleId="ColorfulList-Accent4">
+  <w:style w:type="table" w:styleId="Listavistosa-nfasis4">
     <w:name w:val="Colorful List Accent 4"/>
-    <w:basedOn w:val="TableNormal"/>
+    <w:basedOn w:val="Tablanormal"/>
     <w:uiPriority w:val="72"/>
     <w:rsid w:val="00CB0664"/>
     <w:pPr>
@@ -11731,9 +12247,9 @@
       </w:tcPr>
     </w:tblStylePr>
   </w:style>
-  <w:style w:type="table" w:styleId="ColorfulList-Accent5">
+  <w:style w:type="table" w:styleId="Listavistosa-nfasis5">
     <w:name w:val="Colorful List Accent 5"/>
-    <w:basedOn w:val="TableNormal"/>
+    <w:basedOn w:val="Tablanormal"/>
     <w:uiPriority w:val="72"/>
     <w:rsid w:val="00CB0664"/>
     <w:pPr>
@@ -11810,9 +12326,9 @@
       </w:tcPr>
     </w:tblStylePr>
   </w:style>
-  <w:style w:type="table" w:styleId="ColorfulList-Accent6">
+  <w:style w:type="table" w:styleId="Listavistosa-nfasis6">
     <w:name w:val="Colorful List Accent 6"/>
-    <w:basedOn w:val="TableNormal"/>
+    <w:basedOn w:val="Tablanormal"/>
     <w:uiPriority w:val="72"/>
     <w:rsid w:val="00CB0664"/>
     <w:pPr>
@@ -11889,9 +12405,9 @@
       </w:tcPr>
     </w:tblStylePr>
   </w:style>
-  <w:style w:type="table" w:styleId="ColorfulGrid">
+  <w:style w:type="table" w:styleId="Cuadrculavistosa">
     <w:name w:val="Colorful Grid"/>
-    <w:basedOn w:val="TableNormal"/>
+    <w:basedOn w:val="Tablanormal"/>
     <w:uiPriority w:val="73"/>
     <w:rsid w:val="00CB0664"/>
     <w:pPr>
@@ -11962,9 +12478,9 @@
       </w:tcPr>
     </w:tblStylePr>
   </w:style>
-  <w:style w:type="table" w:styleId="ColorfulGrid-Accent1">
+  <w:style w:type="table" w:styleId="Cuadrculavistosa-nfasis1">
     <w:name w:val="Colorful Grid Accent 1"/>
-    <w:basedOn w:val="TableNormal"/>
+    <w:basedOn w:val="Tablanormal"/>
     <w:uiPriority w:val="73"/>
     <w:rsid w:val="00CB0664"/>
     <w:pPr>
@@ -12035,9 +12551,9 @@
       </w:tcPr>
     </w:tblStylePr>
   </w:style>
-  <w:style w:type="table" w:styleId="ColorfulGrid-Accent2">
+  <w:style w:type="table" w:styleId="Cuadrculavistosa-nfasis2">
     <w:name w:val="Colorful Grid Accent 2"/>
-    <w:basedOn w:val="TableNormal"/>
+    <w:basedOn w:val="Tablanormal"/>
     <w:uiPriority w:val="73"/>
     <w:rsid w:val="00CB0664"/>
     <w:pPr>
@@ -12108,9 +12624,9 @@
       </w:tcPr>
     </w:tblStylePr>
   </w:style>
-  <w:style w:type="table" w:styleId="ColorfulGrid-Accent3">
+  <w:style w:type="table" w:styleId="Cuadrculavistosa-nfasis3">
     <w:name w:val="Colorful Grid Accent 3"/>
-    <w:basedOn w:val="TableNormal"/>
+    <w:basedOn w:val="Tablanormal"/>
     <w:uiPriority w:val="73"/>
     <w:rsid w:val="00CB0664"/>
     <w:pPr>
@@ -12181,9 +12697,9 @@
       </w:tcPr>
     </w:tblStylePr>
   </w:style>
-  <w:style w:type="table" w:styleId="ColorfulGrid-Accent4">
+  <w:style w:type="table" w:styleId="Cuadrculavistosa-nfasis4">
     <w:name w:val="Colorful Grid Accent 4"/>
-    <w:basedOn w:val="TableNormal"/>
+    <w:basedOn w:val="Tablanormal"/>
     <w:uiPriority w:val="73"/>
     <w:rsid w:val="00CB0664"/>
     <w:pPr>
@@ -12254,9 +12770,9 @@
       </w:tcPr>
     </w:tblStylePr>
   </w:style>
-  <w:style w:type="table" w:styleId="ColorfulGrid-Accent5">
+  <w:style w:type="table" w:styleId="Cuadrculavistosa-nfasis5">
     <w:name w:val="Colorful Grid Accent 5"/>
-    <w:basedOn w:val="TableNormal"/>
+    <w:basedOn w:val="Tablanormal"/>
     <w:uiPriority w:val="73"/>
     <w:rsid w:val="00CB0664"/>
     <w:pPr>
@@ -12327,9 +12843,9 @@
       </w:tcPr>
     </w:tblStylePr>
   </w:style>
-  <w:style w:type="table" w:styleId="ColorfulGrid-Accent6">
+  <w:style w:type="table" w:styleId="Cuadrculavistosa-nfasis6">
     <w:name w:val="Colorful Grid Accent 6"/>
-    <w:basedOn w:val="TableNormal"/>
+    <w:basedOn w:val="Tablanormal"/>
     <w:uiPriority w:val="73"/>
     <w:rsid w:val="00CB0664"/>
     <w:pPr>

</xml_diff>